<commit_message>
docs: refresh smart agent quotation pricing
Agent-Logs-Url: https://github.com/AgentForSE/.github/sessions/06f48624-ba1f-402e-b5b1-bb7096d01aae

Co-authored-by: forfire912 <26849387+forfire912@users.noreply.github.com>
</commit_message>
<xml_diff>
--- a/销售/关于智能体系列产品商务报价单.docx
+++ b/销售/关于智能体系列产品商务报价单.docx
@@ -251,146 +251,7 @@
         </w:rPr>
       </w:pPr>
       <w:r>
-        <w:rPr>
-          <w:rFonts w:hint="eastAsia" w:ascii="宋体" w:hAnsi="宋体" w:eastAsia="宋体" w:cs="宋体"/>
-          <w:i w:val="0"/>
-          <w:iCs w:val="0"/>
-          <w:caps w:val="0"/>
-          <w:color w:val="1F2328"/>
-          <w:spacing w:val="0"/>
-          <w:sz w:val="24"/>
-          <w:szCs w:val="24"/>
-          <w:shd w:val="clear" w:fill="FFFFFF"/>
-        </w:rPr>
-        <w:t>感谢贵单位对</w:t>
-      </w:r>
-      <w:r>
-        <w:rPr>
-          <w:rFonts w:hint="eastAsia" w:ascii="宋体" w:hAnsi="宋体" w:eastAsia="宋体" w:cs="宋体"/>
-          <w:i w:val="0"/>
-          <w:iCs w:val="0"/>
-          <w:caps w:val="0"/>
-          <w:color w:val="1F2328"/>
-          <w:spacing w:val="0"/>
-          <w:sz w:val="24"/>
-          <w:szCs w:val="24"/>
-          <w:shd w:val="clear" w:fill="FFFFFF"/>
-          <w:lang w:val="en-US" w:eastAsia="zh-CN"/>
-        </w:rPr>
-        <w:t>装备软件研发</w:t>
-      </w:r>
-      <w:r>
-        <w:rPr>
-          <w:rStyle w:val="7"/>
-          <w:rFonts w:hint="eastAsia" w:ascii="宋体" w:hAnsi="宋体" w:eastAsia="宋体" w:cs="宋体"/>
-          <w:b/>
-          <w:bCs/>
-          <w:i w:val="0"/>
-          <w:iCs w:val="0"/>
-          <w:caps w:val="0"/>
-          <w:color w:val="1F2328"/>
-          <w:spacing w:val="0"/>
-          <w:sz w:val="24"/>
-          <w:szCs w:val="24"/>
-          <w:shd w:val="clear" w:fill="FFFFFF"/>
-        </w:rPr>
-        <w:t xml:space="preserve"> 系列</w:t>
-      </w:r>
-      <w:r>
-        <w:rPr>
-          <w:rStyle w:val="7"/>
-          <w:rFonts w:hint="eastAsia" w:ascii="宋体" w:hAnsi="宋体" w:eastAsia="宋体" w:cs="宋体"/>
-          <w:b/>
-          <w:bCs/>
-          <w:i w:val="0"/>
-          <w:iCs w:val="0"/>
-          <w:caps w:val="0"/>
-          <w:color w:val="1F2328"/>
-          <w:spacing w:val="0"/>
-          <w:sz w:val="24"/>
-          <w:szCs w:val="24"/>
-          <w:shd w:val="clear" w:fill="FFFFFF"/>
-          <w:lang w:val="en-US" w:eastAsia="zh-CN"/>
-        </w:rPr>
-        <w:t>智能体</w:t>
-      </w:r>
-      <w:r>
-        <w:rPr>
-          <w:rStyle w:val="7"/>
-          <w:rFonts w:hint="eastAsia" w:ascii="宋体" w:hAnsi="宋体" w:eastAsia="宋体" w:cs="宋体"/>
-          <w:b/>
-          <w:bCs/>
-          <w:i w:val="0"/>
-          <w:iCs w:val="0"/>
-          <w:caps w:val="0"/>
-          <w:color w:val="1F2328"/>
-          <w:spacing w:val="0"/>
-          <w:sz w:val="24"/>
-          <w:szCs w:val="24"/>
-          <w:shd w:val="clear" w:fill="FFFFFF"/>
-        </w:rPr>
-        <w:t>产品</w:t>
-      </w:r>
-      <w:r>
-        <w:rPr>
-          <w:rStyle w:val="7"/>
-          <w:rFonts w:hint="eastAsia" w:ascii="宋体" w:hAnsi="宋体" w:eastAsia="宋体" w:cs="宋体"/>
-          <w:b/>
-          <w:bCs/>
-          <w:i w:val="0"/>
-          <w:iCs w:val="0"/>
-          <w:caps w:val="0"/>
-          <w:color w:val="1F2328"/>
-          <w:spacing w:val="0"/>
-          <w:sz w:val="24"/>
-          <w:szCs w:val="24"/>
-          <w:shd w:val="clear" w:fill="FFFFFF"/>
-          <w:lang w:val="en-US" w:eastAsia="zh-CN"/>
-        </w:rPr>
-        <w:t xml:space="preserve"> </w:t>
-      </w:r>
-      <w:r>
-        <w:rPr>
-          <w:rFonts w:hint="eastAsia" w:ascii="宋体" w:hAnsi="宋体" w:eastAsia="宋体" w:cs="宋体"/>
-          <w:i w:val="0"/>
-          <w:iCs w:val="0"/>
-          <w:caps w:val="0"/>
-          <w:color w:val="1F2328"/>
-          <w:spacing w:val="0"/>
-          <w:sz w:val="24"/>
-          <w:szCs w:val="24"/>
-          <w:shd w:val="clear" w:fill="FFFFFF"/>
-        </w:rPr>
-        <w:t>的关注与支持。结合贵单位对研发安全分析、功能安全分析、智能</w:t>
-      </w:r>
-      <w:r>
-        <w:rPr>
-          <w:rFonts w:hint="eastAsia" w:ascii="宋体" w:hAnsi="宋体" w:eastAsia="宋体" w:cs="宋体"/>
-          <w:i w:val="0"/>
-          <w:iCs w:val="0"/>
-          <w:caps w:val="0"/>
-          <w:color w:val="1F2328"/>
-          <w:spacing w:val="0"/>
-          <w:sz w:val="24"/>
-          <w:szCs w:val="24"/>
-          <w:shd w:val="clear" w:fill="FFFFFF"/>
-          <w:lang w:val="en-US" w:eastAsia="zh-CN"/>
-        </w:rPr>
-        <w:t>代码</w:t>
-      </w:r>
-      <w:r>
-        <w:rPr>
-          <w:rFonts w:hint="eastAsia" w:ascii="宋体" w:hAnsi="宋体" w:eastAsia="宋体" w:cs="宋体"/>
-          <w:i w:val="0"/>
-          <w:iCs w:val="0"/>
-          <w:caps w:val="0"/>
-          <w:color w:val="1F2328"/>
-          <w:spacing w:val="0"/>
-          <w:sz w:val="24"/>
-          <w:szCs w:val="24"/>
-          <w:shd w:val="clear" w:fill="FFFFFF"/>
-        </w:rPr>
-        <w:t>审查及测试闭环能力的建设需求，现就相关产品授权采购事宜，提交正式商务报价如下，供贵单位评估与决策参考。</w:t>
+        <w:t>感谢贵单位对装备软件研发系列智能体产品的关注与支持。结合贵单位对系统安全分析、软件安全分析、智能代码走查、单元测试及配置项测试闭环能力的建设需求，现就相关产品授权采购事宜，提交正式商务报价如下，供贵单位评估与决策参考。</w:t>
       </w:r>
     </w:p>
     <w:p>
@@ -739,53 +600,8 @@
             <w:vAlign w:val="center"/>
           </w:tcPr>
           <w:p>
-            <w:pPr>
-              <w:keepNext w:val="0"/>
-              <w:keepLines w:val="0"/>
-              <w:pageBreakBefore w:val="0"/>
-              <w:widowControl/>
-              <w:suppressLineNumbers w:val="0"/>
-              <w:kinsoku/>
-              <w:wordWrap/>
-              <w:overflowPunct/>
-              <w:topLinePunct w:val="0"/>
-              <w:autoSpaceDE/>
-              <w:autoSpaceDN/>
-              <w:bidi w:val="0"/>
-              <w:adjustRightInd/>
-              <w:snapToGrid/>
-              <w:spacing w:beforeAutospacing="0" w:afterAutospacing="0" w:line="240" w:lineRule="auto"/>
-              <w:jc w:val="center"/>
-              <w:textAlignment w:val="auto"/>
-              <w:rPr>
-                <w:rFonts w:hint="eastAsia" w:ascii="宋体" w:hAnsi="宋体" w:eastAsia="宋体" w:cs="宋体"/>
-                <w:b/>
-                <w:bCs/>
-                <w:i w:val="0"/>
-                <w:iCs w:val="0"/>
-                <w:caps w:val="0"/>
-                <w:color w:val="1F2328"/>
-                <w:spacing w:val="0"/>
-                <w:sz w:val="21"/>
-                <w:szCs w:val="21"/>
-              </w:rPr>
-            </w:pPr>
-            <w:r>
-              <w:rPr>
-                <w:rFonts w:hint="eastAsia" w:ascii="宋体" w:hAnsi="宋体" w:eastAsia="宋体" w:cs="宋体"/>
-                <w:b/>
-                <w:bCs/>
-                <w:i w:val="0"/>
-                <w:iCs w:val="0"/>
-                <w:caps w:val="0"/>
-                <w:color w:val="1F2328"/>
-                <w:spacing w:val="0"/>
-                <w:kern w:val="0"/>
-                <w:sz w:val="21"/>
-                <w:szCs w:val="21"/>
-                <w:lang w:val="en-US" w:eastAsia="zh-CN" w:bidi="ar"/>
-              </w:rPr>
-              <w:t>年度报价（单用户/年）</w:t>
+            <w:r>
+              <w:t>年度报价（标准授权/年）</w:t>
             </w:r>
           </w:p>
         </w:tc>
@@ -808,53 +624,8 @@
             <w:vAlign w:val="center"/>
           </w:tcPr>
           <w:p>
-            <w:pPr>
-              <w:keepNext w:val="0"/>
-              <w:keepLines w:val="0"/>
-              <w:pageBreakBefore w:val="0"/>
-              <w:widowControl/>
-              <w:suppressLineNumbers w:val="0"/>
-              <w:kinsoku/>
-              <w:wordWrap/>
-              <w:overflowPunct/>
-              <w:topLinePunct w:val="0"/>
-              <w:autoSpaceDE/>
-              <w:autoSpaceDN/>
-              <w:bidi w:val="0"/>
-              <w:adjustRightInd/>
-              <w:snapToGrid/>
-              <w:spacing w:beforeAutospacing="0" w:afterAutospacing="0" w:line="240" w:lineRule="auto"/>
-              <w:jc w:val="center"/>
-              <w:textAlignment w:val="auto"/>
-              <w:rPr>
-                <w:rFonts w:hint="eastAsia" w:ascii="宋体" w:hAnsi="宋体" w:eastAsia="宋体" w:cs="宋体"/>
-                <w:b/>
-                <w:bCs/>
-                <w:i w:val="0"/>
-                <w:iCs w:val="0"/>
-                <w:caps w:val="0"/>
-                <w:color w:val="1F2328"/>
-                <w:spacing w:val="0"/>
-                <w:sz w:val="21"/>
-                <w:szCs w:val="21"/>
-              </w:rPr>
-            </w:pPr>
-            <w:r>
-              <w:rPr>
-                <w:rFonts w:hint="eastAsia" w:ascii="宋体" w:hAnsi="宋体" w:eastAsia="宋体" w:cs="宋体"/>
-                <w:b/>
-                <w:bCs/>
-                <w:i w:val="0"/>
-                <w:iCs w:val="0"/>
-                <w:caps w:val="0"/>
-                <w:color w:val="1F2328"/>
-                <w:spacing w:val="0"/>
-                <w:kern w:val="0"/>
-                <w:sz w:val="21"/>
-                <w:szCs w:val="21"/>
-                <w:lang w:val="en-US" w:eastAsia="zh-CN" w:bidi="ar"/>
-              </w:rPr>
-              <w:t>一次性销售报价（单用户/永久）</w:t>
+            <w:r>
+              <w:t>一次性销售报价（标准授权/永久）</w:t>
             </w:r>
           </w:p>
         </w:tc>
@@ -896,48 +667,7 @@
             <w:vAlign w:val="center"/>
           </w:tcPr>
           <w:p>
-            <w:pPr>
-              <w:keepNext w:val="0"/>
-              <w:keepLines w:val="0"/>
-              <w:pageBreakBefore w:val="0"/>
-              <w:widowControl/>
-              <w:suppressLineNumbers w:val="0"/>
-              <w:kinsoku/>
-              <w:wordWrap/>
-              <w:overflowPunct/>
-              <w:topLinePunct w:val="0"/>
-              <w:autoSpaceDE/>
-              <w:autoSpaceDN/>
-              <w:bidi w:val="0"/>
-              <w:adjustRightInd/>
-              <w:snapToGrid/>
-              <w:spacing w:beforeAutospacing="0" w:afterAutospacing="0" w:line="240" w:lineRule="auto"/>
-              <w:jc w:val="left"/>
-              <w:textAlignment w:val="auto"/>
-              <w:rPr>
-                <w:rFonts w:hint="eastAsia" w:ascii="宋体" w:hAnsi="宋体" w:eastAsia="宋体" w:cs="宋体"/>
-                <w:i w:val="0"/>
-                <w:iCs w:val="0"/>
-                <w:caps w:val="0"/>
-                <w:color w:val="1F2328"/>
-                <w:spacing w:val="0"/>
-                <w:sz w:val="20"/>
-                <w:szCs w:val="20"/>
-              </w:rPr>
-            </w:pPr>
-            <w:r>
-              <w:rPr>
-                <w:rFonts w:hint="eastAsia" w:ascii="宋体" w:hAnsi="宋体" w:eastAsia="宋体" w:cs="宋体"/>
-                <w:i w:val="0"/>
-                <w:iCs w:val="0"/>
-                <w:caps w:val="0"/>
-                <w:color w:val="1F2328"/>
-                <w:spacing w:val="0"/>
-                <w:kern w:val="0"/>
-                <w:sz w:val="20"/>
-                <w:szCs w:val="20"/>
-                <w:lang w:val="en-US" w:eastAsia="zh-CN" w:bidi="ar"/>
-              </w:rPr>
+            <w:r>
               <w:t>SafeWise</w:t>
             </w:r>
           </w:p>
@@ -961,48 +691,7 @@
             <w:vAlign w:val="center"/>
           </w:tcPr>
           <w:p>
-            <w:pPr>
-              <w:keepNext w:val="0"/>
-              <w:keepLines w:val="0"/>
-              <w:pageBreakBefore w:val="0"/>
-              <w:widowControl/>
-              <w:suppressLineNumbers w:val="0"/>
-              <w:kinsoku/>
-              <w:wordWrap/>
-              <w:overflowPunct/>
-              <w:topLinePunct w:val="0"/>
-              <w:autoSpaceDE/>
-              <w:autoSpaceDN/>
-              <w:bidi w:val="0"/>
-              <w:adjustRightInd/>
-              <w:snapToGrid/>
-              <w:spacing w:beforeAutospacing="0" w:afterAutospacing="0" w:line="240" w:lineRule="auto"/>
-              <w:jc w:val="left"/>
-              <w:textAlignment w:val="auto"/>
-              <w:rPr>
-                <w:rFonts w:hint="eastAsia" w:ascii="宋体" w:hAnsi="宋体" w:eastAsia="宋体" w:cs="宋体"/>
-                <w:i w:val="0"/>
-                <w:iCs w:val="0"/>
-                <w:caps w:val="0"/>
-                <w:color w:val="1F2328"/>
-                <w:spacing w:val="0"/>
-                <w:sz w:val="20"/>
-                <w:szCs w:val="20"/>
-              </w:rPr>
-            </w:pPr>
-            <w:r>
-              <w:rPr>
-                <w:rFonts w:hint="eastAsia" w:ascii="宋体" w:hAnsi="宋体" w:eastAsia="宋体" w:cs="宋体"/>
-                <w:i w:val="0"/>
-                <w:iCs w:val="0"/>
-                <w:caps w:val="0"/>
-                <w:color w:val="1F2328"/>
-                <w:spacing w:val="0"/>
-                <w:kern w:val="0"/>
-                <w:sz w:val="20"/>
-                <w:szCs w:val="20"/>
-                <w:lang w:val="en-US" w:eastAsia="zh-CN" w:bidi="ar"/>
-              </w:rPr>
+            <w:r>
               <w:t>系统安全分析工具（STPA）</w:t>
             </w:r>
           </w:p>
@@ -1026,49 +715,8 @@
             <w:vAlign w:val="center"/>
           </w:tcPr>
           <w:p>
-            <w:pPr>
-              <w:keepNext w:val="0"/>
-              <w:keepLines w:val="0"/>
-              <w:pageBreakBefore w:val="0"/>
-              <w:widowControl/>
-              <w:suppressLineNumbers w:val="0"/>
-              <w:kinsoku/>
-              <w:wordWrap/>
-              <w:overflowPunct/>
-              <w:topLinePunct w:val="0"/>
-              <w:autoSpaceDE/>
-              <w:autoSpaceDN/>
-              <w:bidi w:val="0"/>
-              <w:adjustRightInd/>
-              <w:snapToGrid/>
-              <w:spacing w:beforeAutospacing="0" w:afterAutospacing="0" w:line="240" w:lineRule="auto"/>
-              <w:jc w:val="right"/>
-              <w:textAlignment w:val="auto"/>
-              <w:rPr>
-                <w:rFonts w:hint="eastAsia" w:ascii="宋体" w:hAnsi="宋体" w:eastAsia="宋体" w:cs="宋体"/>
-                <w:i w:val="0"/>
-                <w:iCs w:val="0"/>
-                <w:caps w:val="0"/>
-                <w:color w:val="1F2328"/>
-                <w:spacing w:val="0"/>
-                <w:sz w:val="20"/>
-                <w:szCs w:val="20"/>
-              </w:rPr>
-            </w:pPr>
-            <w:r>
-              <w:rPr>
-                <w:rFonts w:hint="eastAsia" w:ascii="宋体" w:hAnsi="宋体" w:eastAsia="宋体" w:cs="宋体"/>
-                <w:i w:val="0"/>
-                <w:iCs w:val="0"/>
-                <w:caps w:val="0"/>
-                <w:color w:val="1F2328"/>
-                <w:spacing w:val="0"/>
-                <w:kern w:val="0"/>
-                <w:sz w:val="20"/>
-                <w:szCs w:val="20"/>
-                <w:lang w:val="en-US" w:eastAsia="zh-CN" w:bidi="ar"/>
-              </w:rPr>
-              <w:t>¥20000</w:t>
+            <w:r>
+              <w:t>¥100,000</w:t>
             </w:r>
           </w:p>
         </w:tc>
@@ -1091,49 +739,8 @@
             <w:vAlign w:val="center"/>
           </w:tcPr>
           <w:p>
-            <w:pPr>
-              <w:keepNext w:val="0"/>
-              <w:keepLines w:val="0"/>
-              <w:pageBreakBefore w:val="0"/>
-              <w:widowControl/>
-              <w:suppressLineNumbers w:val="0"/>
-              <w:kinsoku/>
-              <w:wordWrap/>
-              <w:overflowPunct/>
-              <w:topLinePunct w:val="0"/>
-              <w:autoSpaceDE/>
-              <w:autoSpaceDN/>
-              <w:bidi w:val="0"/>
-              <w:adjustRightInd/>
-              <w:snapToGrid/>
-              <w:spacing w:beforeAutospacing="0" w:afterAutospacing="0" w:line="240" w:lineRule="auto"/>
-              <w:jc w:val="right"/>
-              <w:textAlignment w:val="auto"/>
-              <w:rPr>
-                <w:rFonts w:hint="eastAsia" w:ascii="宋体" w:hAnsi="宋体" w:eastAsia="宋体" w:cs="宋体"/>
-                <w:i w:val="0"/>
-                <w:iCs w:val="0"/>
-                <w:caps w:val="0"/>
-                <w:color w:val="1F2328"/>
-                <w:spacing w:val="0"/>
-                <w:sz w:val="20"/>
-                <w:szCs w:val="20"/>
-              </w:rPr>
-            </w:pPr>
-            <w:r>
-              <w:rPr>
-                <w:rFonts w:hint="eastAsia" w:ascii="宋体" w:hAnsi="宋体" w:eastAsia="宋体" w:cs="宋体"/>
-                <w:i w:val="0"/>
-                <w:iCs w:val="0"/>
-                <w:caps w:val="0"/>
-                <w:color w:val="1F2328"/>
-                <w:spacing w:val="0"/>
-                <w:kern w:val="0"/>
-                <w:sz w:val="20"/>
-                <w:szCs w:val="20"/>
-                <w:lang w:val="en-US" w:eastAsia="zh-CN" w:bidi="ar"/>
-              </w:rPr>
-              <w:t>¥100,000</w:t>
+            <w:r>
+              <w:t>¥500,000</w:t>
             </w:r>
           </w:p>
         </w:tc>
@@ -1175,48 +782,7 @@
             <w:vAlign w:val="center"/>
           </w:tcPr>
           <w:p>
-            <w:pPr>
-              <w:keepNext w:val="0"/>
-              <w:keepLines w:val="0"/>
-              <w:pageBreakBefore w:val="0"/>
-              <w:widowControl/>
-              <w:suppressLineNumbers w:val="0"/>
-              <w:kinsoku/>
-              <w:wordWrap/>
-              <w:overflowPunct/>
-              <w:topLinePunct w:val="0"/>
-              <w:autoSpaceDE/>
-              <w:autoSpaceDN/>
-              <w:bidi w:val="0"/>
-              <w:adjustRightInd/>
-              <w:snapToGrid/>
-              <w:spacing w:beforeAutospacing="0" w:afterAutospacing="0" w:line="240" w:lineRule="auto"/>
-              <w:jc w:val="left"/>
-              <w:textAlignment w:val="auto"/>
-              <w:rPr>
-                <w:rFonts w:hint="eastAsia" w:ascii="宋体" w:hAnsi="宋体" w:eastAsia="宋体" w:cs="宋体"/>
-                <w:i w:val="0"/>
-                <w:iCs w:val="0"/>
-                <w:caps w:val="0"/>
-                <w:color w:val="1F2328"/>
-                <w:spacing w:val="0"/>
-                <w:sz w:val="20"/>
-                <w:szCs w:val="20"/>
-              </w:rPr>
-            </w:pPr>
-            <w:r>
-              <w:rPr>
-                <w:rFonts w:hint="eastAsia" w:ascii="宋体" w:hAnsi="宋体" w:eastAsia="宋体" w:cs="宋体"/>
-                <w:i w:val="0"/>
-                <w:iCs w:val="0"/>
-                <w:caps w:val="0"/>
-                <w:color w:val="1F2328"/>
-                <w:spacing w:val="0"/>
-                <w:kern w:val="0"/>
-                <w:sz w:val="20"/>
-                <w:szCs w:val="20"/>
-                <w:lang w:val="en-US" w:eastAsia="zh-CN" w:bidi="ar"/>
-              </w:rPr>
+            <w:r>
               <w:t>SafeMatrix</w:t>
             </w:r>
           </w:p>
@@ -1240,49 +806,8 @@
             <w:vAlign w:val="center"/>
           </w:tcPr>
           <w:p>
-            <w:pPr>
-              <w:keepNext w:val="0"/>
-              <w:keepLines w:val="0"/>
-              <w:pageBreakBefore w:val="0"/>
-              <w:widowControl/>
-              <w:suppressLineNumbers w:val="0"/>
-              <w:kinsoku/>
-              <w:wordWrap/>
-              <w:overflowPunct/>
-              <w:topLinePunct w:val="0"/>
-              <w:autoSpaceDE/>
-              <w:autoSpaceDN/>
-              <w:bidi w:val="0"/>
-              <w:adjustRightInd/>
-              <w:snapToGrid/>
-              <w:spacing w:beforeAutospacing="0" w:afterAutospacing="0" w:line="240" w:lineRule="auto"/>
-              <w:jc w:val="left"/>
-              <w:textAlignment w:val="auto"/>
-              <w:rPr>
-                <w:rFonts w:hint="eastAsia" w:ascii="宋体" w:hAnsi="宋体" w:eastAsia="宋体" w:cs="宋体"/>
-                <w:i w:val="0"/>
-                <w:iCs w:val="0"/>
-                <w:caps w:val="0"/>
-                <w:color w:val="1F2328"/>
-                <w:spacing w:val="0"/>
-                <w:sz w:val="20"/>
-                <w:szCs w:val="20"/>
-              </w:rPr>
-            </w:pPr>
-            <w:r>
-              <w:rPr>
-                <w:rFonts w:hint="eastAsia" w:ascii="宋体" w:hAnsi="宋体" w:eastAsia="宋体" w:cs="宋体"/>
-                <w:i w:val="0"/>
-                <w:iCs w:val="0"/>
-                <w:caps w:val="0"/>
-                <w:color w:val="1F2328"/>
-                <w:spacing w:val="0"/>
-                <w:kern w:val="0"/>
-                <w:sz w:val="20"/>
-                <w:szCs w:val="20"/>
-                <w:lang w:val="en-US" w:eastAsia="zh-CN" w:bidi="ar"/>
-              </w:rPr>
-              <w:t>软件功能安全分析工具（SFTA + FMEA）</w:t>
+            <w:r>
+              <w:t>软件功能安全分析工具（SFTA + SFMEA）</w:t>
             </w:r>
           </w:p>
         </w:tc>
@@ -1305,49 +830,8 @@
             <w:vAlign w:val="center"/>
           </w:tcPr>
           <w:p>
-            <w:pPr>
-              <w:keepNext w:val="0"/>
-              <w:keepLines w:val="0"/>
-              <w:pageBreakBefore w:val="0"/>
-              <w:widowControl/>
-              <w:suppressLineNumbers w:val="0"/>
-              <w:kinsoku/>
-              <w:wordWrap/>
-              <w:overflowPunct/>
-              <w:topLinePunct w:val="0"/>
-              <w:autoSpaceDE/>
-              <w:autoSpaceDN/>
-              <w:bidi w:val="0"/>
-              <w:adjustRightInd/>
-              <w:snapToGrid/>
-              <w:spacing w:beforeAutospacing="0" w:afterAutospacing="0" w:line="240" w:lineRule="auto"/>
-              <w:jc w:val="right"/>
-              <w:textAlignment w:val="auto"/>
-              <w:rPr>
-                <w:rFonts w:hint="eastAsia" w:ascii="宋体" w:hAnsi="宋体" w:eastAsia="宋体" w:cs="宋体"/>
-                <w:i w:val="0"/>
-                <w:iCs w:val="0"/>
-                <w:caps w:val="0"/>
-                <w:color w:val="1F2328"/>
-                <w:spacing w:val="0"/>
-                <w:sz w:val="20"/>
-                <w:szCs w:val="20"/>
-              </w:rPr>
-            </w:pPr>
-            <w:r>
-              <w:rPr>
-                <w:rFonts w:hint="eastAsia" w:ascii="宋体" w:hAnsi="宋体" w:eastAsia="宋体" w:cs="宋体"/>
-                <w:i w:val="0"/>
-                <w:iCs w:val="0"/>
-                <w:caps w:val="0"/>
-                <w:color w:val="1F2328"/>
-                <w:spacing w:val="0"/>
-                <w:kern w:val="0"/>
-                <w:sz w:val="20"/>
-                <w:szCs w:val="20"/>
-                <w:lang w:val="en-US" w:eastAsia="zh-CN" w:bidi="ar"/>
-              </w:rPr>
-              <w:t>¥30000</w:t>
+            <w:r>
+              <w:t>¥180,000</w:t>
             </w:r>
           </w:p>
         </w:tc>
@@ -1370,49 +854,8 @@
             <w:vAlign w:val="center"/>
           </w:tcPr>
           <w:p>
-            <w:pPr>
-              <w:keepNext w:val="0"/>
-              <w:keepLines w:val="0"/>
-              <w:pageBreakBefore w:val="0"/>
-              <w:widowControl/>
-              <w:suppressLineNumbers w:val="0"/>
-              <w:kinsoku/>
-              <w:wordWrap/>
-              <w:overflowPunct/>
-              <w:topLinePunct w:val="0"/>
-              <w:autoSpaceDE/>
-              <w:autoSpaceDN/>
-              <w:bidi w:val="0"/>
-              <w:adjustRightInd/>
-              <w:snapToGrid/>
-              <w:spacing w:beforeAutospacing="0" w:afterAutospacing="0" w:line="240" w:lineRule="auto"/>
-              <w:jc w:val="right"/>
-              <w:textAlignment w:val="auto"/>
-              <w:rPr>
-                <w:rFonts w:hint="eastAsia" w:ascii="宋体" w:hAnsi="宋体" w:eastAsia="宋体" w:cs="宋体"/>
-                <w:i w:val="0"/>
-                <w:iCs w:val="0"/>
-                <w:caps w:val="0"/>
-                <w:color w:val="1F2328"/>
-                <w:spacing w:val="0"/>
-                <w:sz w:val="20"/>
-                <w:szCs w:val="20"/>
-              </w:rPr>
-            </w:pPr>
-            <w:r>
-              <w:rPr>
-                <w:rFonts w:hint="eastAsia" w:ascii="宋体" w:hAnsi="宋体" w:eastAsia="宋体" w:cs="宋体"/>
-                <w:i w:val="0"/>
-                <w:iCs w:val="0"/>
-                <w:caps w:val="0"/>
-                <w:color w:val="1F2328"/>
-                <w:spacing w:val="0"/>
-                <w:kern w:val="0"/>
-                <w:sz w:val="20"/>
-                <w:szCs w:val="20"/>
-                <w:lang w:val="en-US" w:eastAsia="zh-CN" w:bidi="ar"/>
-              </w:rPr>
-              <w:t>¥150,000</w:t>
+            <w:r>
+              <w:t>¥900,000</w:t>
             </w:r>
           </w:p>
         </w:tc>
@@ -1454,48 +897,7 @@
             <w:vAlign w:val="center"/>
           </w:tcPr>
           <w:p>
-            <w:pPr>
-              <w:keepNext w:val="0"/>
-              <w:keepLines w:val="0"/>
-              <w:pageBreakBefore w:val="0"/>
-              <w:widowControl/>
-              <w:suppressLineNumbers w:val="0"/>
-              <w:kinsoku/>
-              <w:wordWrap/>
-              <w:overflowPunct/>
-              <w:topLinePunct w:val="0"/>
-              <w:autoSpaceDE/>
-              <w:autoSpaceDN/>
-              <w:bidi w:val="0"/>
-              <w:adjustRightInd/>
-              <w:snapToGrid/>
-              <w:spacing w:beforeAutospacing="0" w:afterAutospacing="0" w:line="240" w:lineRule="auto"/>
-              <w:jc w:val="left"/>
-              <w:textAlignment w:val="auto"/>
-              <w:rPr>
-                <w:rFonts w:hint="eastAsia" w:ascii="宋体" w:hAnsi="宋体" w:eastAsia="宋体" w:cs="宋体"/>
-                <w:i w:val="0"/>
-                <w:iCs w:val="0"/>
-                <w:caps w:val="0"/>
-                <w:color w:val="1F2328"/>
-                <w:spacing w:val="0"/>
-                <w:sz w:val="20"/>
-                <w:szCs w:val="20"/>
-              </w:rPr>
-            </w:pPr>
-            <w:r>
-              <w:rPr>
-                <w:rFonts w:hint="eastAsia" w:ascii="宋体" w:hAnsi="宋体" w:eastAsia="宋体" w:cs="宋体"/>
-                <w:i w:val="0"/>
-                <w:iCs w:val="0"/>
-                <w:caps w:val="0"/>
-                <w:color w:val="1F2328"/>
-                <w:spacing w:val="0"/>
-                <w:kern w:val="0"/>
-                <w:sz w:val="20"/>
-                <w:szCs w:val="20"/>
-                <w:lang w:val="en-US" w:eastAsia="zh-CN" w:bidi="ar"/>
-              </w:rPr>
+            <w:r>
               <w:t>SmartInsight</w:t>
             </w:r>
           </w:p>
@@ -1519,50 +921,8 @@
             <w:vAlign w:val="center"/>
           </w:tcPr>
           <w:p>
-            <w:pPr>
-              <w:keepNext w:val="0"/>
-              <w:keepLines w:val="0"/>
-              <w:pageBreakBefore w:val="0"/>
-              <w:widowControl/>
-              <w:suppressLineNumbers w:val="0"/>
-              <w:kinsoku/>
-              <w:wordWrap/>
-              <w:overflowPunct/>
-              <w:topLinePunct w:val="0"/>
-              <w:autoSpaceDE/>
-              <w:autoSpaceDN/>
-              <w:bidi w:val="0"/>
-              <w:adjustRightInd/>
-              <w:snapToGrid/>
-              <w:spacing w:beforeAutospacing="0" w:afterAutospacing="0" w:line="240" w:lineRule="auto"/>
-              <w:jc w:val="left"/>
-              <w:textAlignment w:val="auto"/>
-              <w:rPr>
-                <w:rFonts w:hint="default" w:ascii="宋体" w:hAnsi="宋体" w:eastAsia="宋体" w:cs="宋体"/>
-                <w:i w:val="0"/>
-                <w:iCs w:val="0"/>
-                <w:caps w:val="0"/>
-                <w:color w:val="1F2328"/>
-                <w:spacing w:val="0"/>
-                <w:sz w:val="20"/>
-                <w:szCs w:val="20"/>
-                <w:lang w:val="en-US"/>
-              </w:rPr>
-            </w:pPr>
-            <w:r>
-              <w:rPr>
-                <w:rFonts w:hint="eastAsia" w:ascii="宋体" w:hAnsi="宋体" w:eastAsia="宋体" w:cs="宋体"/>
-                <w:i w:val="0"/>
-                <w:iCs w:val="0"/>
-                <w:caps w:val="0"/>
-                <w:color w:val="1F2328"/>
-                <w:spacing w:val="0"/>
-                <w:kern w:val="0"/>
-                <w:sz w:val="20"/>
-                <w:szCs w:val="20"/>
-                <w:lang w:val="en-US" w:eastAsia="zh-CN" w:bidi="ar"/>
-              </w:rPr>
-              <w:t>需求-设计-代码一致性审查与智能代码走查工具</w:t>
+            <w:r>
+              <w:t>需求/设计/代码一致性审查与智能代码走查工具</w:t>
             </w:r>
           </w:p>
         </w:tc>
@@ -1585,50 +945,8 @@
             <w:vAlign w:val="center"/>
           </w:tcPr>
           <w:p>
-            <w:pPr>
-              <w:keepNext w:val="0"/>
-              <w:keepLines w:val="0"/>
-              <w:pageBreakBefore w:val="0"/>
-              <w:widowControl/>
-              <w:suppressLineNumbers w:val="0"/>
-              <w:kinsoku/>
-              <w:wordWrap/>
-              <w:overflowPunct/>
-              <w:topLinePunct w:val="0"/>
-              <w:autoSpaceDE/>
-              <w:autoSpaceDN/>
-              <w:bidi w:val="0"/>
-              <w:adjustRightInd/>
-              <w:snapToGrid/>
-              <w:spacing w:beforeAutospacing="0" w:afterAutospacing="0" w:line="240" w:lineRule="auto"/>
-              <w:jc w:val="right"/>
-              <w:textAlignment w:val="auto"/>
-              <w:rPr>
-                <w:rFonts w:hint="default" w:ascii="宋体" w:hAnsi="宋体" w:eastAsia="宋体" w:cs="宋体"/>
-                <w:i w:val="0"/>
-                <w:iCs w:val="0"/>
-                <w:caps w:val="0"/>
-                <w:color w:val="1F2328"/>
-                <w:spacing w:val="0"/>
-                <w:sz w:val="20"/>
-                <w:szCs w:val="20"/>
-                <w:lang w:val="en-US"/>
-              </w:rPr>
-            </w:pPr>
-            <w:r>
-              <w:rPr>
-                <w:rFonts w:hint="eastAsia" w:ascii="宋体" w:hAnsi="宋体" w:eastAsia="宋体" w:cs="宋体"/>
-                <w:i w:val="0"/>
-                <w:iCs w:val="0"/>
-                <w:caps w:val="0"/>
-                <w:color w:val="1F2328"/>
-                <w:spacing w:val="0"/>
-                <w:kern w:val="0"/>
-                <w:sz w:val="20"/>
-                <w:szCs w:val="20"/>
-                <w:lang w:val="en-US" w:eastAsia="zh-CN" w:bidi="ar"/>
-              </w:rPr>
-              <w:t>¥30000</w:t>
+            <w:r>
+              <w:t>¥100,000</w:t>
             </w:r>
           </w:p>
         </w:tc>
@@ -1651,49 +969,8 @@
             <w:vAlign w:val="center"/>
           </w:tcPr>
           <w:p>
-            <w:pPr>
-              <w:keepNext w:val="0"/>
-              <w:keepLines w:val="0"/>
-              <w:pageBreakBefore w:val="0"/>
-              <w:widowControl/>
-              <w:suppressLineNumbers w:val="0"/>
-              <w:kinsoku/>
-              <w:wordWrap/>
-              <w:overflowPunct/>
-              <w:topLinePunct w:val="0"/>
-              <w:autoSpaceDE/>
-              <w:autoSpaceDN/>
-              <w:bidi w:val="0"/>
-              <w:adjustRightInd/>
-              <w:snapToGrid/>
-              <w:spacing w:beforeAutospacing="0" w:afterAutospacing="0" w:line="240" w:lineRule="auto"/>
-              <w:jc w:val="right"/>
-              <w:textAlignment w:val="auto"/>
-              <w:rPr>
-                <w:rFonts w:hint="eastAsia" w:ascii="宋体" w:hAnsi="宋体" w:eastAsia="宋体" w:cs="宋体"/>
-                <w:i w:val="0"/>
-                <w:iCs w:val="0"/>
-                <w:caps w:val="0"/>
-                <w:color w:val="1F2328"/>
-                <w:spacing w:val="0"/>
-                <w:sz w:val="20"/>
-                <w:szCs w:val="20"/>
-              </w:rPr>
-            </w:pPr>
-            <w:r>
-              <w:rPr>
-                <w:rFonts w:hint="eastAsia" w:ascii="宋体" w:hAnsi="宋体" w:eastAsia="宋体" w:cs="宋体"/>
-                <w:i w:val="0"/>
-                <w:iCs w:val="0"/>
-                <w:caps w:val="0"/>
-                <w:color w:val="1F2328"/>
-                <w:spacing w:val="0"/>
-                <w:kern w:val="0"/>
-                <w:sz w:val="20"/>
-                <w:szCs w:val="20"/>
-                <w:lang w:val="en-US" w:eastAsia="zh-CN" w:bidi="ar"/>
-              </w:rPr>
-              <w:t>¥150,000</w:t>
+            <w:r>
+              <w:t>¥500,000</w:t>
             </w:r>
           </w:p>
         </w:tc>
@@ -1734,49 +1011,8 @@
             <w:vAlign w:val="center"/>
           </w:tcPr>
           <w:p>
-            <w:pPr>
-              <w:keepNext w:val="0"/>
-              <w:keepLines w:val="0"/>
-              <w:pageBreakBefore w:val="0"/>
-              <w:widowControl/>
-              <w:suppressLineNumbers w:val="0"/>
-              <w:kinsoku/>
-              <w:wordWrap/>
-              <w:overflowPunct/>
-              <w:topLinePunct w:val="0"/>
-              <w:autoSpaceDE/>
-              <w:autoSpaceDN/>
-              <w:bidi w:val="0"/>
-              <w:adjustRightInd/>
-              <w:snapToGrid/>
-              <w:spacing w:beforeAutospacing="0" w:afterAutospacing="0" w:line="240" w:lineRule="auto"/>
-              <w:jc w:val="left"/>
-              <w:textAlignment w:val="auto"/>
-              <w:rPr>
-                <w:rFonts w:hint="eastAsia" w:ascii="宋体" w:hAnsi="宋体" w:eastAsia="宋体" w:cs="宋体"/>
-                <w:i w:val="0"/>
-                <w:iCs w:val="0"/>
-                <w:caps w:val="0"/>
-                <w:color w:val="1F2328"/>
-                <w:spacing w:val="0"/>
-                <w:sz w:val="20"/>
-                <w:szCs w:val="20"/>
-              </w:rPr>
-            </w:pPr>
-            <w:r>
-              <w:rPr>
-                <w:rFonts w:hint="eastAsia" w:ascii="宋体" w:hAnsi="宋体" w:eastAsia="宋体" w:cs="宋体"/>
-                <w:i w:val="0"/>
-                <w:iCs w:val="0"/>
-                <w:caps w:val="0"/>
-                <w:color w:val="1F2328"/>
-                <w:spacing w:val="0"/>
-                <w:kern w:val="0"/>
-                <w:sz w:val="20"/>
-                <w:szCs w:val="20"/>
-                <w:lang w:val="en-US" w:eastAsia="zh-CN" w:bidi="ar"/>
-              </w:rPr>
-              <w:t>SmartST</w:t>
+            <w:r>
+              <w:t>SmartUT</w:t>
             </w:r>
           </w:p>
         </w:tc>
@@ -1799,50 +1035,8 @@
             <w:vAlign w:val="center"/>
           </w:tcPr>
           <w:p>
-            <w:pPr>
-              <w:keepNext w:val="0"/>
-              <w:keepLines w:val="0"/>
-              <w:pageBreakBefore w:val="0"/>
-              <w:widowControl/>
-              <w:suppressLineNumbers w:val="0"/>
-              <w:kinsoku/>
-              <w:wordWrap/>
-              <w:overflowPunct/>
-              <w:topLinePunct w:val="0"/>
-              <w:autoSpaceDE/>
-              <w:autoSpaceDN/>
-              <w:bidi w:val="0"/>
-              <w:adjustRightInd/>
-              <w:snapToGrid/>
-              <w:spacing w:beforeAutospacing="0" w:afterAutospacing="0" w:line="240" w:lineRule="auto"/>
-              <w:jc w:val="left"/>
-              <w:textAlignment w:val="auto"/>
-              <w:rPr>
-                <w:rFonts w:hint="default" w:ascii="宋体" w:hAnsi="宋体" w:eastAsia="宋体" w:cs="宋体"/>
-                <w:i w:val="0"/>
-                <w:iCs w:val="0"/>
-                <w:caps w:val="0"/>
-                <w:color w:val="1F2328"/>
-                <w:spacing w:val="0"/>
-                <w:sz w:val="20"/>
-                <w:szCs w:val="20"/>
-                <w:lang w:val="en-US"/>
-              </w:rPr>
-            </w:pPr>
-            <w:r>
-              <w:rPr>
-                <w:rFonts w:hint="eastAsia" w:ascii="宋体" w:hAnsi="宋体" w:eastAsia="宋体" w:cs="宋体"/>
-                <w:i w:val="0"/>
-                <w:iCs w:val="0"/>
-                <w:caps w:val="0"/>
-                <w:color w:val="1F2328"/>
-                <w:spacing w:val="0"/>
-                <w:kern w:val="0"/>
-                <w:sz w:val="20"/>
-                <w:szCs w:val="20"/>
-                <w:lang w:val="en-US" w:eastAsia="zh-CN" w:bidi="ar"/>
-              </w:rPr>
-              <w:t>系统测试自动化与测试闭环工具</w:t>
+            <w:r>
+              <w:t>单元测试用例生成与执行闭环工具</w:t>
             </w:r>
           </w:p>
         </w:tc>
@@ -1865,50 +1059,8 @@
             <w:vAlign w:val="center"/>
           </w:tcPr>
           <w:p>
-            <w:pPr>
-              <w:keepNext w:val="0"/>
-              <w:keepLines w:val="0"/>
-              <w:pageBreakBefore w:val="0"/>
-              <w:widowControl/>
-              <w:suppressLineNumbers w:val="0"/>
-              <w:kinsoku/>
-              <w:wordWrap/>
-              <w:overflowPunct/>
-              <w:topLinePunct w:val="0"/>
-              <w:autoSpaceDE/>
-              <w:autoSpaceDN/>
-              <w:bidi w:val="0"/>
-              <w:adjustRightInd/>
-              <w:snapToGrid/>
-              <w:spacing w:beforeAutospacing="0" w:afterAutospacing="0" w:line="240" w:lineRule="auto"/>
-              <w:jc w:val="right"/>
-              <w:textAlignment w:val="auto"/>
-              <w:rPr>
-                <w:rFonts w:hint="default" w:ascii="宋体" w:hAnsi="宋体" w:eastAsia="宋体" w:cs="宋体"/>
-                <w:i w:val="0"/>
-                <w:iCs w:val="0"/>
-                <w:caps w:val="0"/>
-                <w:color w:val="1F2328"/>
-                <w:spacing w:val="0"/>
-                <w:sz w:val="20"/>
-                <w:szCs w:val="20"/>
-                <w:lang w:val="en-US"/>
-              </w:rPr>
-            </w:pPr>
-            <w:r>
-              <w:rPr>
-                <w:rFonts w:hint="eastAsia" w:ascii="宋体" w:hAnsi="宋体" w:eastAsia="宋体" w:cs="宋体"/>
-                <w:i w:val="0"/>
-                <w:iCs w:val="0"/>
-                <w:caps w:val="0"/>
-                <w:color w:val="1F2328"/>
-                <w:spacing w:val="0"/>
-                <w:kern w:val="0"/>
-                <w:sz w:val="20"/>
-                <w:szCs w:val="20"/>
-                <w:lang w:val="en-US" w:eastAsia="zh-CN" w:bidi="ar"/>
-              </w:rPr>
-              <w:t>¥20000</w:t>
+            <w:r>
+              <w:t>¥140,000</w:t>
             </w:r>
           </w:p>
         </w:tc>
@@ -1931,270 +1083,50 @@
             <w:vAlign w:val="center"/>
           </w:tcPr>
           <w:p>
-            <w:pPr>
-              <w:keepNext w:val="0"/>
-              <w:keepLines w:val="0"/>
-              <w:pageBreakBefore w:val="0"/>
-              <w:widowControl/>
-              <w:suppressLineNumbers w:val="0"/>
-              <w:kinsoku/>
-              <w:wordWrap/>
-              <w:overflowPunct/>
-              <w:topLinePunct w:val="0"/>
-              <w:autoSpaceDE/>
-              <w:autoSpaceDN/>
-              <w:bidi w:val="0"/>
-              <w:adjustRightInd/>
-              <w:snapToGrid/>
-              <w:spacing w:beforeAutospacing="0" w:afterAutospacing="0" w:line="240" w:lineRule="auto"/>
-              <w:jc w:val="right"/>
-              <w:textAlignment w:val="auto"/>
-              <w:rPr>
-                <w:rFonts w:hint="eastAsia" w:ascii="宋体" w:hAnsi="宋体" w:eastAsia="宋体" w:cs="宋体"/>
-                <w:i w:val="0"/>
-                <w:iCs w:val="0"/>
-                <w:caps w:val="0"/>
-                <w:color w:val="1F2328"/>
-                <w:spacing w:val="0"/>
-                <w:sz w:val="20"/>
-                <w:szCs w:val="20"/>
-              </w:rPr>
-            </w:pPr>
-            <w:r>
-              <w:rPr>
-                <w:rFonts w:hint="eastAsia" w:ascii="宋体" w:hAnsi="宋体" w:eastAsia="宋体" w:cs="宋体"/>
-                <w:i w:val="0"/>
-                <w:iCs w:val="0"/>
-                <w:caps w:val="0"/>
-                <w:color w:val="1F2328"/>
-                <w:spacing w:val="0"/>
-                <w:kern w:val="0"/>
-                <w:sz w:val="20"/>
-                <w:szCs w:val="20"/>
-                <w:lang w:val="en-US" w:eastAsia="zh-CN" w:bidi="ar"/>
-              </w:rPr>
-              <w:t>¥100,000</w:t>
+            <w:r>
+              <w:t>¥700,000</w:t>
             </w:r>
           </w:p>
         </w:tc>
       </w:tr>
       <w:tr>
-        <w:tblPrEx>
-          <w:tblBorders>
-            <w:top w:val="none" w:color="auto" w:sz="0" w:space="0"/>
-            <w:left w:val="none" w:color="auto" w:sz="0" w:space="0"/>
-            <w:bottom w:val="none" w:color="auto" w:sz="0" w:space="0"/>
-            <w:right w:val="none" w:color="auto" w:sz="0" w:space="0"/>
-            <w:insideH w:val="none" w:color="auto" w:sz="0" w:space="0"/>
-            <w:insideV w:val="none" w:color="auto" w:sz="0" w:space="0"/>
-          </w:tblBorders>
-          <w:shd w:val="clear" w:color="auto" w:fill="FFFFFF"/>
-          <w:tblCellMar>
-            <w:top w:w="15" w:type="dxa"/>
-            <w:left w:w="15" w:type="dxa"/>
-            <w:bottom w:w="15" w:type="dxa"/>
-            <w:right w:w="15" w:type="dxa"/>
-          </w:tblCellMar>
-        </w:tblPrEx>
-        <w:tc>
-          <w:tcPr>
-            <w:tcW w:w="1605" w:type="dxa"/>
-            <w:tcBorders>
-              <w:top w:val="single" w:color="D1D9E0" w:sz="6" w:space="0"/>
-              <w:left w:val="single" w:color="D1D9E0" w:sz="6" w:space="0"/>
-              <w:bottom w:val="single" w:color="D1D9E0" w:sz="6" w:space="0"/>
-              <w:right w:val="single" w:color="D1D9E0" w:sz="6" w:space="0"/>
-            </w:tcBorders>
-            <w:shd w:val="clear" w:color="auto" w:fill="F6F8FA"/>
-            <w:tcMar>
-              <w:top w:w="90" w:type="dxa"/>
-              <w:left w:w="195" w:type="dxa"/>
-              <w:bottom w:w="90" w:type="dxa"/>
-              <w:right w:w="195" w:type="dxa"/>
-            </w:tcMar>
-            <w:vAlign w:val="center"/>
-          </w:tcPr>
-          <w:p>
-            <w:pPr>
-              <w:keepNext w:val="0"/>
-              <w:keepLines w:val="0"/>
-              <w:pageBreakBefore w:val="0"/>
-              <w:widowControl/>
-              <w:suppressLineNumbers w:val="0"/>
-              <w:kinsoku/>
-              <w:wordWrap/>
-              <w:overflowPunct/>
-              <w:topLinePunct w:val="0"/>
-              <w:autoSpaceDE/>
-              <w:autoSpaceDN/>
-              <w:bidi w:val="0"/>
-              <w:adjustRightInd/>
-              <w:snapToGrid/>
-              <w:spacing w:beforeAutospacing="0" w:afterAutospacing="0" w:line="240" w:lineRule="auto"/>
-              <w:jc w:val="left"/>
-              <w:textAlignment w:val="auto"/>
-              <w:rPr>
-                <w:rFonts w:hint="default" w:ascii="宋体" w:hAnsi="宋体" w:eastAsia="宋体" w:cs="宋体"/>
-                <w:i w:val="0"/>
-                <w:iCs w:val="0"/>
-                <w:caps w:val="0"/>
-                <w:color w:val="1F2328"/>
-                <w:spacing w:val="0"/>
-                <w:kern w:val="0"/>
-                <w:sz w:val="20"/>
-                <w:szCs w:val="20"/>
-                <w:lang w:val="en-US" w:eastAsia="zh-CN" w:bidi="ar"/>
-              </w:rPr>
-            </w:pPr>
-            <w:r>
-              <w:rPr>
-                <w:rFonts w:hint="eastAsia" w:ascii="宋体" w:hAnsi="宋体" w:eastAsia="宋体" w:cs="宋体"/>
-                <w:i w:val="0"/>
-                <w:iCs w:val="0"/>
-                <w:caps w:val="0"/>
-                <w:color w:val="1F2328"/>
-                <w:spacing w:val="0"/>
-                <w:kern w:val="0"/>
-                <w:sz w:val="20"/>
-                <w:szCs w:val="20"/>
-                <w:lang w:val="en-US" w:eastAsia="zh-CN" w:bidi="ar"/>
-              </w:rPr>
-              <w:t>知会一号</w:t>
-            </w:r>
-          </w:p>
-        </w:tc>
-        <w:tc>
-          <w:tcPr>
-            <w:tcW w:w="2657" w:type="dxa"/>
-            <w:tcBorders>
-              <w:top w:val="single" w:color="D1D9E0" w:sz="6" w:space="0"/>
-              <w:left w:val="single" w:color="D1D9E0" w:sz="6" w:space="0"/>
-              <w:bottom w:val="single" w:color="D1D9E0" w:sz="6" w:space="0"/>
-              <w:right w:val="single" w:color="D1D9E0" w:sz="6" w:space="0"/>
-            </w:tcBorders>
-            <w:shd w:val="clear" w:color="auto" w:fill="F6F8FA"/>
-            <w:tcMar>
-              <w:top w:w="90" w:type="dxa"/>
-              <w:left w:w="195" w:type="dxa"/>
-              <w:bottom w:w="90" w:type="dxa"/>
-              <w:right w:w="195" w:type="dxa"/>
-            </w:tcMar>
-            <w:vAlign w:val="center"/>
-          </w:tcPr>
-          <w:p>
-            <w:pPr>
-              <w:keepNext w:val="0"/>
-              <w:keepLines w:val="0"/>
-              <w:pageBreakBefore w:val="0"/>
-              <w:widowControl/>
-              <w:suppressLineNumbers w:val="0"/>
-              <w:kinsoku/>
-              <w:wordWrap/>
-              <w:overflowPunct/>
-              <w:topLinePunct w:val="0"/>
-              <w:autoSpaceDE/>
-              <w:autoSpaceDN/>
-              <w:bidi w:val="0"/>
-              <w:adjustRightInd/>
-              <w:snapToGrid/>
-              <w:spacing w:beforeAutospacing="0" w:afterAutospacing="0" w:line="240" w:lineRule="auto"/>
-              <w:jc w:val="left"/>
-              <w:textAlignment w:val="auto"/>
-              <w:rPr>
-                <w:rFonts w:hint="default" w:ascii="宋体" w:hAnsi="宋体" w:eastAsia="宋体" w:cs="宋体"/>
-                <w:i w:val="0"/>
-                <w:iCs w:val="0"/>
-                <w:caps w:val="0"/>
-                <w:color w:val="1F2328"/>
-                <w:spacing w:val="0"/>
-                <w:kern w:val="0"/>
-                <w:sz w:val="20"/>
-                <w:szCs w:val="20"/>
-                <w:lang w:val="en-US" w:eastAsia="zh-CN" w:bidi="ar"/>
-              </w:rPr>
-            </w:pPr>
-            <w:r>
-              <w:rPr>
-                <w:rFonts w:hint="eastAsia" w:ascii="宋体" w:hAnsi="宋体" w:eastAsia="宋体" w:cs="宋体"/>
-                <w:i w:val="0"/>
-                <w:iCs w:val="0"/>
-                <w:caps w:val="0"/>
-                <w:color w:val="1F2328"/>
-                <w:spacing w:val="0"/>
-                <w:kern w:val="0"/>
-                <w:sz w:val="20"/>
-                <w:szCs w:val="20"/>
-                <w:lang w:val="en-US" w:eastAsia="zh-CN" w:bidi="ar"/>
-              </w:rPr>
-              <w:t>内部/敏感的智能会议纪要系统</w:t>
-            </w:r>
-          </w:p>
-        </w:tc>
-        <w:tc>
-          <w:tcPr>
-            <w:tcW w:w="4434" w:type="dxa"/>
-            <w:gridSpan w:val="2"/>
-            <w:tcBorders>
-              <w:top w:val="single" w:color="D1D9E0" w:sz="6" w:space="0"/>
-              <w:left w:val="single" w:color="D1D9E0" w:sz="6" w:space="0"/>
-              <w:bottom w:val="single" w:color="D1D9E0" w:sz="6" w:space="0"/>
-              <w:right w:val="single" w:color="D1D9E0" w:sz="6" w:space="0"/>
-            </w:tcBorders>
-            <w:shd w:val="clear" w:color="auto" w:fill="F6F8FA"/>
-            <w:tcMar>
-              <w:top w:w="90" w:type="dxa"/>
-              <w:left w:w="195" w:type="dxa"/>
-              <w:bottom w:w="90" w:type="dxa"/>
-              <w:right w:w="195" w:type="dxa"/>
-            </w:tcMar>
-            <w:vAlign w:val="center"/>
-          </w:tcPr>
-          <w:p>
-            <w:pPr>
-              <w:keepNext w:val="0"/>
-              <w:keepLines w:val="0"/>
-              <w:pageBreakBefore w:val="0"/>
-              <w:widowControl/>
-              <w:suppressLineNumbers w:val="0"/>
-              <w:kinsoku/>
-              <w:wordWrap/>
-              <w:overflowPunct/>
-              <w:topLinePunct w:val="0"/>
-              <w:autoSpaceDE/>
-              <w:autoSpaceDN/>
-              <w:bidi w:val="0"/>
-              <w:adjustRightInd/>
-              <w:snapToGrid/>
-              <w:spacing w:beforeAutospacing="0" w:afterAutospacing="0" w:line="240" w:lineRule="auto"/>
-              <w:jc w:val="right"/>
-              <w:textAlignment w:val="auto"/>
-              <w:rPr>
-                <w:rFonts w:hint="eastAsia" w:ascii="宋体" w:hAnsi="宋体" w:eastAsia="宋体" w:cs="宋体"/>
-                <w:i w:val="0"/>
-                <w:iCs w:val="0"/>
-                <w:caps w:val="0"/>
-                <w:color w:val="1F2328"/>
-                <w:spacing w:val="0"/>
-                <w:kern w:val="0"/>
-                <w:sz w:val="20"/>
-                <w:szCs w:val="20"/>
-                <w:lang w:val="en-US" w:eastAsia="zh-CN" w:bidi="ar"/>
-              </w:rPr>
-            </w:pPr>
-            <w:r>
-              <w:rPr>
-                <w:rFonts w:hint="eastAsia" w:ascii="宋体" w:hAnsi="宋体" w:eastAsia="宋体" w:cs="宋体"/>
-                <w:i w:val="0"/>
-                <w:iCs w:val="0"/>
-                <w:caps w:val="0"/>
-                <w:color w:val="1F2328"/>
-                <w:spacing w:val="0"/>
-                <w:kern w:val="0"/>
-                <w:sz w:val="20"/>
-                <w:szCs w:val="20"/>
-                <w:lang w:val="en-US" w:eastAsia="zh-CN" w:bidi="ar"/>
-              </w:rPr>
-              <w:t>¥200,000</w:t>
+        <w:tc>
+          <w:tcPr>
+            <w:tcW w:type="dxa" w:w="1605"/>
+          </w:tcPr>
+          <w:p>
+            <w:r>
+              <w:t>SmartST</w:t>
+            </w:r>
+          </w:p>
+        </w:tc>
+        <w:tc>
+          <w:tcPr>
+            <w:tcW w:type="dxa" w:w="2657"/>
+          </w:tcPr>
+          <w:p>
+            <w:r>
+              <w:t>配置项测试用例生成与测试闭环工具</w:t>
+            </w:r>
+          </w:p>
+        </w:tc>
+        <w:tc>
+          <w:tcPr>
+            <w:tcW w:type="dxa" w:w="2121"/>
+          </w:tcPr>
+          <w:p>
+            <w:r>
+              <w:t>¥120,000</w:t>
+            </w:r>
+          </w:p>
+        </w:tc>
+        <w:tc>
+          <w:tcPr>
+            <w:tcW w:type="dxa" w:w="2313"/>
+          </w:tcPr>
+          <w:p>
+            <w:r>
+              <w:t>¥600,000</w:t>
             </w:r>
           </w:p>
         </w:tc>
@@ -2616,48 +1548,7 @@
             <w:vAlign w:val="center"/>
           </w:tcPr>
           <w:p>
-            <w:pPr>
-              <w:keepNext w:val="0"/>
-              <w:keepLines w:val="0"/>
-              <w:pageBreakBefore w:val="0"/>
-              <w:widowControl/>
-              <w:suppressLineNumbers w:val="0"/>
-              <w:kinsoku/>
-              <w:wordWrap/>
-              <w:overflowPunct/>
-              <w:topLinePunct w:val="0"/>
-              <w:autoSpaceDE/>
-              <w:autoSpaceDN/>
-              <w:bidi w:val="0"/>
-              <w:adjustRightInd/>
-              <w:snapToGrid/>
-              <w:spacing w:beforeAutospacing="0" w:afterAutospacing="0" w:line="240" w:lineRule="auto"/>
-              <w:jc w:val="left"/>
-              <w:textAlignment w:val="auto"/>
-              <w:rPr>
-                <w:rFonts w:hint="eastAsia" w:ascii="宋体" w:hAnsi="宋体" w:eastAsia="宋体" w:cs="宋体"/>
-                <w:i w:val="0"/>
-                <w:iCs w:val="0"/>
-                <w:caps w:val="0"/>
-                <w:color w:val="1F2328"/>
-                <w:spacing w:val="0"/>
-                <w:sz w:val="21"/>
-                <w:szCs w:val="21"/>
-              </w:rPr>
-            </w:pPr>
-            <w:r>
-              <w:rPr>
-                <w:rFonts w:hint="eastAsia" w:ascii="宋体" w:hAnsi="宋体" w:eastAsia="宋体" w:cs="宋体"/>
-                <w:i w:val="0"/>
-                <w:iCs w:val="0"/>
-                <w:caps w:val="0"/>
-                <w:color w:val="1F2328"/>
-                <w:spacing w:val="0"/>
-                <w:kern w:val="0"/>
-                <w:sz w:val="21"/>
-                <w:szCs w:val="21"/>
-                <w:lang w:val="en-US" w:eastAsia="zh-CN" w:bidi="ar"/>
-              </w:rPr>
+            <w:r>
               <w:t>研发安全基础包</w:t>
             </w:r>
           </w:p>
@@ -2681,48 +1572,7 @@
             <w:vAlign w:val="center"/>
           </w:tcPr>
           <w:p>
-            <w:pPr>
-              <w:keepNext w:val="0"/>
-              <w:keepLines w:val="0"/>
-              <w:pageBreakBefore w:val="0"/>
-              <w:widowControl/>
-              <w:suppressLineNumbers w:val="0"/>
-              <w:kinsoku/>
-              <w:wordWrap/>
-              <w:overflowPunct/>
-              <w:topLinePunct w:val="0"/>
-              <w:autoSpaceDE/>
-              <w:autoSpaceDN/>
-              <w:bidi w:val="0"/>
-              <w:adjustRightInd/>
-              <w:snapToGrid/>
-              <w:spacing w:beforeAutospacing="0" w:afterAutospacing="0" w:line="240" w:lineRule="auto"/>
-              <w:jc w:val="left"/>
-              <w:textAlignment w:val="auto"/>
-              <w:rPr>
-                <w:rFonts w:hint="eastAsia" w:ascii="宋体" w:hAnsi="宋体" w:eastAsia="宋体" w:cs="宋体"/>
-                <w:i w:val="0"/>
-                <w:iCs w:val="0"/>
-                <w:caps w:val="0"/>
-                <w:color w:val="1F2328"/>
-                <w:spacing w:val="0"/>
-                <w:sz w:val="21"/>
-                <w:szCs w:val="21"/>
-              </w:rPr>
-            </w:pPr>
-            <w:r>
-              <w:rPr>
-                <w:rFonts w:hint="eastAsia" w:ascii="宋体" w:hAnsi="宋体" w:eastAsia="宋体" w:cs="宋体"/>
-                <w:i w:val="0"/>
-                <w:iCs w:val="0"/>
-                <w:caps w:val="0"/>
-                <w:color w:val="1F2328"/>
-                <w:spacing w:val="0"/>
-                <w:kern w:val="0"/>
-                <w:sz w:val="21"/>
-                <w:szCs w:val="21"/>
-                <w:lang w:val="en-US" w:eastAsia="zh-CN" w:bidi="ar"/>
-              </w:rPr>
+            <w:r>
               <w:t>SafeWise + SafeMatrix</w:t>
             </w:r>
           </w:p>
@@ -2746,49 +1596,8 @@
             <w:vAlign w:val="center"/>
           </w:tcPr>
           <w:p>
-            <w:pPr>
-              <w:keepNext w:val="0"/>
-              <w:keepLines w:val="0"/>
-              <w:pageBreakBefore w:val="0"/>
-              <w:widowControl/>
-              <w:suppressLineNumbers w:val="0"/>
-              <w:kinsoku/>
-              <w:wordWrap/>
-              <w:overflowPunct/>
-              <w:topLinePunct w:val="0"/>
-              <w:autoSpaceDE/>
-              <w:autoSpaceDN/>
-              <w:bidi w:val="0"/>
-              <w:adjustRightInd/>
-              <w:snapToGrid/>
-              <w:spacing w:beforeAutospacing="0" w:afterAutospacing="0" w:line="240" w:lineRule="auto"/>
-              <w:jc w:val="right"/>
-              <w:textAlignment w:val="auto"/>
-              <w:rPr>
-                <w:rFonts w:hint="eastAsia" w:ascii="宋体" w:hAnsi="宋体" w:eastAsia="宋体" w:cs="宋体"/>
-                <w:i w:val="0"/>
-                <w:iCs w:val="0"/>
-                <w:caps w:val="0"/>
-                <w:color w:val="1F2328"/>
-                <w:spacing w:val="0"/>
-                <w:sz w:val="21"/>
-                <w:szCs w:val="21"/>
-              </w:rPr>
-            </w:pPr>
-            <w:r>
-              <w:rPr>
-                <w:rFonts w:hint="eastAsia" w:ascii="宋体" w:hAnsi="宋体" w:eastAsia="宋体" w:cs="宋体"/>
-                <w:i w:val="0"/>
-                <w:iCs w:val="0"/>
-                <w:caps w:val="0"/>
-                <w:color w:val="1F2328"/>
-                <w:spacing w:val="0"/>
-                <w:kern w:val="0"/>
-                <w:sz w:val="21"/>
-                <w:szCs w:val="21"/>
-                <w:lang w:val="en-US" w:eastAsia="zh-CN" w:bidi="ar"/>
-              </w:rPr>
-              <w:t>¥50,000</w:t>
+            <w:r>
+              <w:t>¥240,000</w:t>
             </w:r>
           </w:p>
         </w:tc>
@@ -2811,49 +1620,8 @@
             <w:vAlign w:val="center"/>
           </w:tcPr>
           <w:p>
-            <w:pPr>
-              <w:keepNext w:val="0"/>
-              <w:keepLines w:val="0"/>
-              <w:pageBreakBefore w:val="0"/>
-              <w:widowControl/>
-              <w:suppressLineNumbers w:val="0"/>
-              <w:kinsoku/>
-              <w:wordWrap/>
-              <w:overflowPunct/>
-              <w:topLinePunct w:val="0"/>
-              <w:autoSpaceDE/>
-              <w:autoSpaceDN/>
-              <w:bidi w:val="0"/>
-              <w:adjustRightInd/>
-              <w:snapToGrid/>
-              <w:spacing w:beforeAutospacing="0" w:afterAutospacing="0" w:line="240" w:lineRule="auto"/>
-              <w:jc w:val="right"/>
-              <w:textAlignment w:val="auto"/>
-              <w:rPr>
-                <w:rFonts w:hint="eastAsia" w:ascii="宋体" w:hAnsi="宋体" w:eastAsia="宋体" w:cs="宋体"/>
-                <w:i w:val="0"/>
-                <w:iCs w:val="0"/>
-                <w:caps w:val="0"/>
-                <w:color w:val="1F2328"/>
-                <w:spacing w:val="0"/>
-                <w:sz w:val="21"/>
-                <w:szCs w:val="21"/>
-              </w:rPr>
-            </w:pPr>
-            <w:r>
-              <w:rPr>
-                <w:rFonts w:hint="eastAsia" w:ascii="宋体" w:hAnsi="宋体" w:eastAsia="宋体" w:cs="宋体"/>
-                <w:i w:val="0"/>
-                <w:iCs w:val="0"/>
-                <w:caps w:val="0"/>
-                <w:color w:val="1F2328"/>
-                <w:spacing w:val="0"/>
-                <w:kern w:val="0"/>
-                <w:sz w:val="21"/>
-                <w:szCs w:val="21"/>
-                <w:lang w:val="en-US" w:eastAsia="zh-CN" w:bidi="ar"/>
-              </w:rPr>
-              <w:t>¥200,000</w:t>
+            <w:r>
+              <w:t>¥1,200,000</w:t>
             </w:r>
           </w:p>
         </w:tc>
@@ -2895,48 +1663,7 @@
             <w:vAlign w:val="center"/>
           </w:tcPr>
           <w:p>
-            <w:pPr>
-              <w:keepNext w:val="0"/>
-              <w:keepLines w:val="0"/>
-              <w:pageBreakBefore w:val="0"/>
-              <w:widowControl/>
-              <w:suppressLineNumbers w:val="0"/>
-              <w:kinsoku/>
-              <w:wordWrap/>
-              <w:overflowPunct/>
-              <w:topLinePunct w:val="0"/>
-              <w:autoSpaceDE/>
-              <w:autoSpaceDN/>
-              <w:bidi w:val="0"/>
-              <w:adjustRightInd/>
-              <w:snapToGrid/>
-              <w:spacing w:beforeAutospacing="0" w:afterAutospacing="0" w:line="240" w:lineRule="auto"/>
-              <w:jc w:val="left"/>
-              <w:textAlignment w:val="auto"/>
-              <w:rPr>
-                <w:rFonts w:hint="eastAsia" w:ascii="宋体" w:hAnsi="宋体" w:eastAsia="宋体" w:cs="宋体"/>
-                <w:i w:val="0"/>
-                <w:iCs w:val="0"/>
-                <w:caps w:val="0"/>
-                <w:color w:val="1F2328"/>
-                <w:spacing w:val="0"/>
-                <w:sz w:val="21"/>
-                <w:szCs w:val="21"/>
-              </w:rPr>
-            </w:pPr>
-            <w:r>
-              <w:rPr>
-                <w:rFonts w:hint="eastAsia" w:ascii="宋体" w:hAnsi="宋体" w:eastAsia="宋体" w:cs="宋体"/>
-                <w:i w:val="0"/>
-                <w:iCs w:val="0"/>
-                <w:caps w:val="0"/>
-                <w:color w:val="1F2328"/>
-                <w:spacing w:val="0"/>
-                <w:kern w:val="0"/>
-                <w:sz w:val="21"/>
-                <w:szCs w:val="21"/>
-                <w:lang w:val="en-US" w:eastAsia="zh-CN" w:bidi="ar"/>
-              </w:rPr>
+            <w:r>
               <w:t>研发审查增强包</w:t>
             </w:r>
           </w:p>
@@ -2960,49 +1687,8 @@
             <w:vAlign w:val="center"/>
           </w:tcPr>
           <w:p>
-            <w:pPr>
-              <w:keepNext w:val="0"/>
-              <w:keepLines w:val="0"/>
-              <w:pageBreakBefore w:val="0"/>
-              <w:widowControl/>
-              <w:suppressLineNumbers w:val="0"/>
-              <w:kinsoku/>
-              <w:wordWrap/>
-              <w:overflowPunct/>
-              <w:topLinePunct w:val="0"/>
-              <w:autoSpaceDE/>
-              <w:autoSpaceDN/>
-              <w:bidi w:val="0"/>
-              <w:adjustRightInd/>
-              <w:snapToGrid/>
-              <w:spacing w:beforeAutospacing="0" w:afterAutospacing="0" w:line="240" w:lineRule="auto"/>
-              <w:jc w:val="left"/>
-              <w:textAlignment w:val="auto"/>
-              <w:rPr>
-                <w:rFonts w:hint="eastAsia" w:ascii="宋体" w:hAnsi="宋体" w:eastAsia="宋体" w:cs="宋体"/>
-                <w:i w:val="0"/>
-                <w:iCs w:val="0"/>
-                <w:caps w:val="0"/>
-                <w:color w:val="1F2328"/>
-                <w:spacing w:val="0"/>
-                <w:sz w:val="21"/>
-                <w:szCs w:val="21"/>
-              </w:rPr>
-            </w:pPr>
-            <w:r>
-              <w:rPr>
-                <w:rFonts w:hint="eastAsia" w:ascii="宋体" w:hAnsi="宋体" w:eastAsia="宋体" w:cs="宋体"/>
-                <w:i w:val="0"/>
-                <w:iCs w:val="0"/>
-                <w:caps w:val="0"/>
-                <w:color w:val="1F2328"/>
-                <w:spacing w:val="0"/>
-                <w:kern w:val="0"/>
-                <w:sz w:val="21"/>
-                <w:szCs w:val="21"/>
-                <w:lang w:val="en-US" w:eastAsia="zh-CN" w:bidi="ar"/>
-              </w:rPr>
-              <w:t>SmartInsight + SmartST</w:t>
+            <w:r>
+              <w:t>SmartInsight + SmartUT</w:t>
             </w:r>
           </w:p>
         </w:tc>
@@ -3025,49 +1711,8 @@
             <w:vAlign w:val="center"/>
           </w:tcPr>
           <w:p>
-            <w:pPr>
-              <w:keepNext w:val="0"/>
-              <w:keepLines w:val="0"/>
-              <w:pageBreakBefore w:val="0"/>
-              <w:widowControl/>
-              <w:suppressLineNumbers w:val="0"/>
-              <w:kinsoku/>
-              <w:wordWrap/>
-              <w:overflowPunct/>
-              <w:topLinePunct w:val="0"/>
-              <w:autoSpaceDE/>
-              <w:autoSpaceDN/>
-              <w:bidi w:val="0"/>
-              <w:adjustRightInd/>
-              <w:snapToGrid/>
-              <w:spacing w:beforeAutospacing="0" w:afterAutospacing="0" w:line="240" w:lineRule="auto"/>
-              <w:jc w:val="right"/>
-              <w:textAlignment w:val="auto"/>
-              <w:rPr>
-                <w:rFonts w:hint="eastAsia" w:ascii="宋体" w:hAnsi="宋体" w:eastAsia="宋体" w:cs="宋体"/>
-                <w:i w:val="0"/>
-                <w:iCs w:val="0"/>
-                <w:caps w:val="0"/>
-                <w:color w:val="1F2328"/>
-                <w:spacing w:val="0"/>
-                <w:sz w:val="21"/>
-                <w:szCs w:val="21"/>
-              </w:rPr>
-            </w:pPr>
-            <w:r>
-              <w:rPr>
-                <w:rFonts w:hint="eastAsia" w:ascii="宋体" w:hAnsi="宋体" w:eastAsia="宋体" w:cs="宋体"/>
-                <w:i w:val="0"/>
-                <w:iCs w:val="0"/>
-                <w:caps w:val="0"/>
-                <w:color w:val="1F2328"/>
-                <w:spacing w:val="0"/>
-                <w:kern w:val="0"/>
-                <w:sz w:val="21"/>
-                <w:szCs w:val="21"/>
-                <w:lang w:val="en-US" w:eastAsia="zh-CN" w:bidi="ar"/>
-              </w:rPr>
-              <w:t>¥50,000</w:t>
+            <w:r>
+              <w:t>¥200,000</w:t>
             </w:r>
           </w:p>
         </w:tc>
@@ -3090,49 +1735,8 @@
             <w:vAlign w:val="center"/>
           </w:tcPr>
           <w:p>
-            <w:pPr>
-              <w:keepNext w:val="0"/>
-              <w:keepLines w:val="0"/>
-              <w:pageBreakBefore w:val="0"/>
-              <w:widowControl/>
-              <w:suppressLineNumbers w:val="0"/>
-              <w:kinsoku/>
-              <w:wordWrap/>
-              <w:overflowPunct/>
-              <w:topLinePunct w:val="0"/>
-              <w:autoSpaceDE/>
-              <w:autoSpaceDN/>
-              <w:bidi w:val="0"/>
-              <w:adjustRightInd/>
-              <w:snapToGrid/>
-              <w:spacing w:beforeAutospacing="0" w:afterAutospacing="0" w:line="240" w:lineRule="auto"/>
-              <w:jc w:val="right"/>
-              <w:textAlignment w:val="auto"/>
-              <w:rPr>
-                <w:rFonts w:hint="eastAsia" w:ascii="宋体" w:hAnsi="宋体" w:eastAsia="宋体" w:cs="宋体"/>
-                <w:i w:val="0"/>
-                <w:iCs w:val="0"/>
-                <w:caps w:val="0"/>
-                <w:color w:val="1F2328"/>
-                <w:spacing w:val="0"/>
-                <w:sz w:val="21"/>
-                <w:szCs w:val="21"/>
-              </w:rPr>
-            </w:pPr>
-            <w:r>
-              <w:rPr>
-                <w:rFonts w:hint="eastAsia" w:ascii="宋体" w:hAnsi="宋体" w:eastAsia="宋体" w:cs="宋体"/>
-                <w:i w:val="0"/>
-                <w:iCs w:val="0"/>
-                <w:caps w:val="0"/>
-                <w:color w:val="1F2328"/>
-                <w:spacing w:val="0"/>
-                <w:kern w:val="0"/>
-                <w:sz w:val="21"/>
-                <w:szCs w:val="21"/>
-                <w:lang w:val="en-US" w:eastAsia="zh-CN" w:bidi="ar"/>
-              </w:rPr>
-              <w:t>¥200,000</w:t>
+            <w:r>
+              <w:t>¥1,000,000</w:t>
             </w:r>
           </w:p>
         </w:tc>
@@ -3174,48 +1778,7 @@
             <w:vAlign w:val="center"/>
           </w:tcPr>
           <w:p>
-            <w:pPr>
-              <w:keepNext w:val="0"/>
-              <w:keepLines w:val="0"/>
-              <w:pageBreakBefore w:val="0"/>
-              <w:widowControl/>
-              <w:suppressLineNumbers w:val="0"/>
-              <w:kinsoku/>
-              <w:wordWrap/>
-              <w:overflowPunct/>
-              <w:topLinePunct w:val="0"/>
-              <w:autoSpaceDE/>
-              <w:autoSpaceDN/>
-              <w:bidi w:val="0"/>
-              <w:adjustRightInd/>
-              <w:snapToGrid/>
-              <w:spacing w:beforeAutospacing="0" w:afterAutospacing="0" w:line="240" w:lineRule="auto"/>
-              <w:jc w:val="left"/>
-              <w:textAlignment w:val="auto"/>
-              <w:rPr>
-                <w:rFonts w:hint="eastAsia" w:ascii="宋体" w:hAnsi="宋体" w:eastAsia="宋体" w:cs="宋体"/>
-                <w:i w:val="0"/>
-                <w:iCs w:val="0"/>
-                <w:caps w:val="0"/>
-                <w:color w:val="1F2328"/>
-                <w:spacing w:val="0"/>
-                <w:sz w:val="21"/>
-                <w:szCs w:val="21"/>
-              </w:rPr>
-            </w:pPr>
-            <w:r>
-              <w:rPr>
-                <w:rFonts w:hint="eastAsia" w:ascii="宋体" w:hAnsi="宋体" w:eastAsia="宋体" w:cs="宋体"/>
-                <w:i w:val="0"/>
-                <w:iCs w:val="0"/>
-                <w:caps w:val="0"/>
-                <w:color w:val="1F2328"/>
-                <w:spacing w:val="0"/>
-                <w:kern w:val="0"/>
-                <w:sz w:val="21"/>
-                <w:szCs w:val="21"/>
-                <w:lang w:val="en-US" w:eastAsia="zh-CN" w:bidi="ar"/>
-              </w:rPr>
+            <w:r>
               <w:t>全套工具包</w:t>
             </w:r>
           </w:p>
@@ -3239,49 +1802,8 @@
             <w:vAlign w:val="center"/>
           </w:tcPr>
           <w:p>
-            <w:pPr>
-              <w:keepNext w:val="0"/>
-              <w:keepLines w:val="0"/>
-              <w:pageBreakBefore w:val="0"/>
-              <w:widowControl/>
-              <w:suppressLineNumbers w:val="0"/>
-              <w:kinsoku/>
-              <w:wordWrap/>
-              <w:overflowPunct/>
-              <w:topLinePunct w:val="0"/>
-              <w:autoSpaceDE/>
-              <w:autoSpaceDN/>
-              <w:bidi w:val="0"/>
-              <w:adjustRightInd/>
-              <w:snapToGrid/>
-              <w:spacing w:beforeAutospacing="0" w:afterAutospacing="0" w:line="240" w:lineRule="auto"/>
-              <w:jc w:val="left"/>
-              <w:textAlignment w:val="auto"/>
-              <w:rPr>
-                <w:rFonts w:hint="eastAsia" w:ascii="宋体" w:hAnsi="宋体" w:eastAsia="宋体" w:cs="宋体"/>
-                <w:i w:val="0"/>
-                <w:iCs w:val="0"/>
-                <w:caps w:val="0"/>
-                <w:color w:val="1F2328"/>
-                <w:spacing w:val="0"/>
-                <w:sz w:val="21"/>
-                <w:szCs w:val="21"/>
-              </w:rPr>
-            </w:pPr>
-            <w:r>
-              <w:rPr>
-                <w:rFonts w:hint="eastAsia" w:ascii="宋体" w:hAnsi="宋体" w:eastAsia="宋体" w:cs="宋体"/>
-                <w:i w:val="0"/>
-                <w:iCs w:val="0"/>
-                <w:caps w:val="0"/>
-                <w:color w:val="1F2328"/>
-                <w:spacing w:val="0"/>
-                <w:kern w:val="0"/>
-                <w:sz w:val="21"/>
-                <w:szCs w:val="21"/>
-                <w:lang w:val="en-US" w:eastAsia="zh-CN" w:bidi="ar"/>
-              </w:rPr>
-              <w:t>SafeWise + SafeMatrix + SmartInsight + SmartST</w:t>
+            <w:r>
+              <w:t>SafeWise + SafeMatrix + SmartInsight + SmartUT + SmartST</w:t>
             </w:r>
           </w:p>
         </w:tc>
@@ -3304,49 +1826,8 @@
             <w:vAlign w:val="center"/>
           </w:tcPr>
           <w:p>
-            <w:pPr>
-              <w:keepNext w:val="0"/>
-              <w:keepLines w:val="0"/>
-              <w:pageBreakBefore w:val="0"/>
-              <w:widowControl/>
-              <w:suppressLineNumbers w:val="0"/>
-              <w:kinsoku/>
-              <w:wordWrap/>
-              <w:overflowPunct/>
-              <w:topLinePunct w:val="0"/>
-              <w:autoSpaceDE/>
-              <w:autoSpaceDN/>
-              <w:bidi w:val="0"/>
-              <w:adjustRightInd/>
-              <w:snapToGrid/>
-              <w:spacing w:beforeAutospacing="0" w:afterAutospacing="0" w:line="240" w:lineRule="auto"/>
-              <w:jc w:val="right"/>
-              <w:textAlignment w:val="auto"/>
-              <w:rPr>
-                <w:rFonts w:hint="eastAsia" w:ascii="宋体" w:hAnsi="宋体" w:eastAsia="宋体" w:cs="宋体"/>
-                <w:i w:val="0"/>
-                <w:iCs w:val="0"/>
-                <w:caps w:val="0"/>
-                <w:color w:val="1F2328"/>
-                <w:spacing w:val="0"/>
-                <w:sz w:val="21"/>
-                <w:szCs w:val="21"/>
-              </w:rPr>
-            </w:pPr>
-            <w:r>
-              <w:rPr>
-                <w:rFonts w:hint="eastAsia" w:ascii="宋体" w:hAnsi="宋体" w:eastAsia="宋体" w:cs="宋体"/>
-                <w:i w:val="0"/>
-                <w:iCs w:val="0"/>
-                <w:caps w:val="0"/>
-                <w:color w:val="1F2328"/>
-                <w:spacing w:val="0"/>
-                <w:kern w:val="0"/>
-                <w:sz w:val="21"/>
-                <w:szCs w:val="21"/>
-                <w:lang w:val="en-US" w:eastAsia="zh-CN" w:bidi="ar"/>
-              </w:rPr>
-              <w:t>¥100,000</w:t>
+            <w:r>
+              <w:t>¥500,000</w:t>
             </w:r>
           </w:p>
         </w:tc>
@@ -3369,49 +1850,8 @@
             <w:vAlign w:val="center"/>
           </w:tcPr>
           <w:p>
-            <w:pPr>
-              <w:keepNext w:val="0"/>
-              <w:keepLines w:val="0"/>
-              <w:pageBreakBefore w:val="0"/>
-              <w:widowControl/>
-              <w:suppressLineNumbers w:val="0"/>
-              <w:kinsoku/>
-              <w:wordWrap/>
-              <w:overflowPunct/>
-              <w:topLinePunct w:val="0"/>
-              <w:autoSpaceDE/>
-              <w:autoSpaceDN/>
-              <w:bidi w:val="0"/>
-              <w:adjustRightInd/>
-              <w:snapToGrid/>
-              <w:spacing w:beforeAutospacing="0" w:afterAutospacing="0" w:line="240" w:lineRule="auto"/>
-              <w:jc w:val="right"/>
-              <w:textAlignment w:val="auto"/>
-              <w:rPr>
-                <w:rFonts w:hint="eastAsia" w:ascii="宋体" w:hAnsi="宋体" w:eastAsia="宋体" w:cs="宋体"/>
-                <w:i w:val="0"/>
-                <w:iCs w:val="0"/>
-                <w:caps w:val="0"/>
-                <w:color w:val="1F2328"/>
-                <w:spacing w:val="0"/>
-                <w:sz w:val="21"/>
-                <w:szCs w:val="21"/>
-              </w:rPr>
-            </w:pPr>
-            <w:r>
-              <w:rPr>
-                <w:rFonts w:hint="eastAsia" w:ascii="宋体" w:hAnsi="宋体" w:eastAsia="宋体" w:cs="宋体"/>
-                <w:i w:val="0"/>
-                <w:iCs w:val="0"/>
-                <w:caps w:val="0"/>
-                <w:color w:val="1F2328"/>
-                <w:spacing w:val="0"/>
-                <w:kern w:val="0"/>
-                <w:sz w:val="21"/>
-                <w:szCs w:val="21"/>
-                <w:lang w:val="en-US" w:eastAsia="zh-CN" w:bidi="ar"/>
-              </w:rPr>
-              <w:t>¥300,000</w:t>
+            <w:r>
+              <w:t>¥2,500,000</w:t>
             </w:r>
           </w:p>
         </w:tc>
@@ -3765,178 +2205,7 @@
         </w:rPr>
       </w:pPr>
       <w:r>
-        <w:rPr>
-          <w:rFonts w:hint="eastAsia" w:ascii="宋体" w:hAnsi="宋体" w:eastAsia="宋体" w:cs="宋体"/>
-          <w:i w:val="0"/>
-          <w:iCs w:val="0"/>
-          <w:caps w:val="0"/>
-          <w:color w:val="1F2328"/>
-          <w:spacing w:val="0"/>
-          <w:sz w:val="24"/>
-          <w:szCs w:val="24"/>
-          <w:shd w:val="clear" w:fill="FFFFFF"/>
-        </w:rPr>
-        <w:t>SmartInsight</w:t>
-      </w:r>
-      <w:r>
-        <w:rPr>
-          <w:rFonts w:hint="eastAsia" w:ascii="宋体" w:hAnsi="宋体" w:eastAsia="宋体" w:cs="宋体"/>
-          <w:i w:val="0"/>
-          <w:iCs w:val="0"/>
-          <w:caps w:val="0"/>
-          <w:color w:val="1F2328"/>
-          <w:spacing w:val="0"/>
-          <w:sz w:val="24"/>
-          <w:szCs w:val="24"/>
-          <w:shd w:val="clear" w:fill="FFFFFF"/>
-          <w:lang w:eastAsia="zh-CN"/>
-        </w:rPr>
-        <w:t>：</w:t>
-      </w:r>
-      <w:r>
-        <w:rPr>
-          <w:rFonts w:hint="eastAsia" w:ascii="宋体" w:hAnsi="宋体" w:eastAsia="宋体" w:cs="宋体"/>
-          <w:i w:val="0"/>
-          <w:iCs w:val="0"/>
-          <w:caps w:val="0"/>
-          <w:color w:val="1F2328"/>
-          <w:spacing w:val="0"/>
-          <w:sz w:val="24"/>
-          <w:szCs w:val="24"/>
-          <w:shd w:val="clear" w:fill="FFFFFF"/>
-        </w:rPr>
-        <w:t>面向高可靠软件研发场景的需求条目解析与确认</w:t>
-      </w:r>
-      <w:r>
-        <w:rPr>
-          <w:rFonts w:hint="eastAsia" w:ascii="宋体" w:hAnsi="宋体" w:eastAsia="宋体" w:cs="宋体"/>
-          <w:i w:val="0"/>
-          <w:iCs w:val="0"/>
-          <w:caps w:val="0"/>
-          <w:color w:val="1F2328"/>
-          <w:spacing w:val="0"/>
-          <w:sz w:val="24"/>
-          <w:szCs w:val="24"/>
-          <w:shd w:val="clear" w:fill="FFFFFF"/>
-          <w:lang w:eastAsia="zh-CN"/>
-        </w:rPr>
-        <w:t>、</w:t>
-      </w:r>
-      <w:r>
-        <w:rPr>
-          <w:rFonts w:hint="eastAsia" w:ascii="宋体" w:hAnsi="宋体" w:eastAsia="宋体" w:cs="宋体"/>
-          <w:i w:val="0"/>
-          <w:iCs w:val="0"/>
-          <w:caps w:val="0"/>
-          <w:color w:val="1F2328"/>
-          <w:spacing w:val="0"/>
-          <w:sz w:val="24"/>
-          <w:szCs w:val="24"/>
-          <w:shd w:val="clear" w:fill="FFFFFF"/>
-        </w:rPr>
-        <w:t>设计条目解析与验证</w:t>
-      </w:r>
-      <w:r>
-        <w:rPr>
-          <w:rFonts w:hint="eastAsia" w:ascii="宋体" w:hAnsi="宋体" w:eastAsia="宋体" w:cs="宋体"/>
-          <w:i w:val="0"/>
-          <w:iCs w:val="0"/>
-          <w:caps w:val="0"/>
-          <w:color w:val="1F2328"/>
-          <w:spacing w:val="0"/>
-          <w:sz w:val="24"/>
-          <w:szCs w:val="24"/>
-          <w:shd w:val="clear" w:fill="FFFFFF"/>
-          <w:lang w:eastAsia="zh-CN"/>
-        </w:rPr>
-        <w:t>、</w:t>
-      </w:r>
-      <w:r>
-        <w:rPr>
-          <w:rFonts w:hint="eastAsia" w:ascii="宋体" w:hAnsi="宋体" w:eastAsia="宋体" w:cs="宋体"/>
-          <w:i w:val="0"/>
-          <w:iCs w:val="0"/>
-          <w:caps w:val="0"/>
-          <w:color w:val="1F2328"/>
-          <w:spacing w:val="0"/>
-          <w:sz w:val="24"/>
-          <w:szCs w:val="24"/>
-          <w:shd w:val="clear" w:fill="FFFFFF"/>
-        </w:rPr>
-        <w:t>代码故障模式管理与校验</w:t>
-      </w:r>
-      <w:r>
-        <w:rPr>
-          <w:rFonts w:hint="eastAsia" w:ascii="宋体" w:hAnsi="宋体" w:eastAsia="宋体" w:cs="宋体"/>
-          <w:i w:val="0"/>
-          <w:iCs w:val="0"/>
-          <w:caps w:val="0"/>
-          <w:color w:val="1F2328"/>
-          <w:spacing w:val="0"/>
-          <w:sz w:val="24"/>
-          <w:szCs w:val="24"/>
-          <w:shd w:val="clear" w:fill="FFFFFF"/>
-          <w:lang w:eastAsia="zh-CN"/>
-        </w:rPr>
-        <w:t>、</w:t>
-      </w:r>
-      <w:r>
-        <w:rPr>
-          <w:rFonts w:hint="eastAsia" w:ascii="宋体" w:hAnsi="宋体" w:eastAsia="宋体" w:cs="宋体"/>
-          <w:i w:val="0"/>
-          <w:iCs w:val="0"/>
-          <w:caps w:val="0"/>
-          <w:color w:val="1F2328"/>
-          <w:spacing w:val="0"/>
-          <w:sz w:val="24"/>
-          <w:szCs w:val="24"/>
-          <w:shd w:val="clear" w:fill="FFFFFF"/>
-        </w:rPr>
-        <w:t>静态分析结果归一化</w:t>
-      </w:r>
-      <w:r>
-        <w:rPr>
-          <w:rFonts w:hint="eastAsia" w:ascii="宋体" w:hAnsi="宋体" w:eastAsia="宋体" w:cs="宋体"/>
-          <w:i w:val="0"/>
-          <w:iCs w:val="0"/>
-          <w:caps w:val="0"/>
-          <w:color w:val="1F2328"/>
-          <w:spacing w:val="0"/>
-          <w:sz w:val="24"/>
-          <w:szCs w:val="24"/>
-          <w:shd w:val="clear" w:fill="FFFFFF"/>
-          <w:lang w:val="en-US" w:eastAsia="zh-CN"/>
-        </w:rPr>
-        <w:t>及智能</w:t>
-      </w:r>
-      <w:r>
-        <w:rPr>
-          <w:rFonts w:hint="eastAsia" w:ascii="宋体" w:hAnsi="宋体" w:eastAsia="宋体" w:cs="宋体"/>
-          <w:i w:val="0"/>
-          <w:iCs w:val="0"/>
-          <w:caps w:val="0"/>
-          <w:color w:val="1F2328"/>
-          <w:spacing w:val="0"/>
-          <w:sz w:val="24"/>
-          <w:szCs w:val="24"/>
-          <w:shd w:val="clear" w:fill="FFFFFF"/>
-        </w:rPr>
-        <w:t>处理</w:t>
-      </w:r>
-      <w:r>
-        <w:rPr>
-          <w:rFonts w:hint="eastAsia" w:ascii="宋体" w:hAnsi="宋体" w:eastAsia="宋体" w:cs="宋体"/>
-          <w:i w:val="0"/>
-          <w:iCs w:val="0"/>
-          <w:caps w:val="0"/>
-          <w:color w:val="1F2328"/>
-          <w:spacing w:val="0"/>
-          <w:sz w:val="24"/>
-          <w:szCs w:val="24"/>
-          <w:shd w:val="clear" w:fill="FFFFFF"/>
-          <w:lang w:val="en-US" w:eastAsia="zh-CN"/>
-        </w:rPr>
-        <w:t>等。</w:t>
+        <w:t>SmartInsight：面向高可靠软件研发场景的需求条目解析与确认、设计条目解析与验证、代码故障模式管理与校验、静态分析结果归一化及智能处理。</w:t>
       </w:r>
     </w:p>
     <w:p>
@@ -3974,76 +2243,7 @@
         </w:rPr>
       </w:pPr>
       <w:r>
-        <w:rPr>
-          <w:rFonts w:hint="eastAsia" w:ascii="宋体" w:hAnsi="宋体" w:eastAsia="宋体" w:cs="宋体"/>
-          <w:i w:val="0"/>
-          <w:iCs w:val="0"/>
-          <w:caps w:val="0"/>
-          <w:color w:val="1F2328"/>
-          <w:spacing w:val="0"/>
-          <w:sz w:val="24"/>
-          <w:szCs w:val="24"/>
-          <w:shd w:val="clear" w:fill="FFFFFF"/>
-        </w:rPr>
-        <w:t>SmartST：面向</w:t>
-      </w:r>
-      <w:r>
-        <w:rPr>
-          <w:rFonts w:hint="eastAsia" w:ascii="宋体" w:hAnsi="宋体" w:eastAsia="宋体" w:cs="宋体"/>
-          <w:i w:val="0"/>
-          <w:iCs w:val="0"/>
-          <w:caps w:val="0"/>
-          <w:color w:val="1F2328"/>
-          <w:spacing w:val="0"/>
-          <w:sz w:val="24"/>
-          <w:szCs w:val="24"/>
-          <w:shd w:val="clear" w:fill="FFFFFF"/>
-          <w:lang w:val="en-US" w:eastAsia="zh-CN"/>
-        </w:rPr>
-        <w:t>配置项</w:t>
-      </w:r>
-      <w:r>
-        <w:rPr>
-          <w:rFonts w:hint="eastAsia" w:ascii="宋体" w:hAnsi="宋体" w:eastAsia="宋体" w:cs="宋体"/>
-          <w:i w:val="0"/>
-          <w:iCs w:val="0"/>
-          <w:caps w:val="0"/>
-          <w:color w:val="1F2328"/>
-          <w:spacing w:val="0"/>
-          <w:sz w:val="24"/>
-          <w:szCs w:val="24"/>
-          <w:shd w:val="clear" w:fill="FFFFFF"/>
-        </w:rPr>
-        <w:t>测试自动化与验证闭环，支持测试</w:t>
-      </w:r>
-      <w:r>
-        <w:rPr>
-          <w:rFonts w:hint="eastAsia" w:ascii="宋体" w:hAnsi="宋体" w:eastAsia="宋体" w:cs="宋体"/>
-          <w:i w:val="0"/>
-          <w:iCs w:val="0"/>
-          <w:caps w:val="0"/>
-          <w:color w:val="1F2328"/>
-          <w:spacing w:val="0"/>
-          <w:sz w:val="24"/>
-          <w:szCs w:val="24"/>
-          <w:shd w:val="clear" w:fill="FFFFFF"/>
-          <w:lang w:val="en-US" w:eastAsia="zh-CN"/>
-        </w:rPr>
-        <w:t>用例生成（含测试数据）</w:t>
-      </w:r>
-      <w:r>
-        <w:rPr>
-          <w:rFonts w:hint="eastAsia" w:ascii="宋体" w:hAnsi="宋体" w:eastAsia="宋体" w:cs="宋体"/>
-          <w:i w:val="0"/>
-          <w:iCs w:val="0"/>
-          <w:caps w:val="0"/>
-          <w:color w:val="1F2328"/>
-          <w:spacing w:val="0"/>
-          <w:sz w:val="24"/>
-          <w:szCs w:val="24"/>
-          <w:shd w:val="clear" w:fill="FFFFFF"/>
-        </w:rPr>
-        <w:t>、执行回填及覆盖率统计。</w:t>
+        <w:t>SmartUT：面向嵌入式 C 软件单元测试场景，支持基于设计与形式化方法的测试场景生成、自动执行、覆盖率统计及测试报告生成。</w:t>
       </w:r>
     </w:p>
     <w:p>
@@ -4082,79 +2282,8 @@
         </w:rPr>
       </w:pPr>
       <w:r>
-        <w:rPr>
-          <w:rFonts w:hint="eastAsia" w:ascii="宋体" w:hAnsi="宋体" w:eastAsia="宋体" w:cs="宋体"/>
-          <w:i w:val="0"/>
-          <w:iCs w:val="0"/>
-          <w:caps w:val="0"/>
-          <w:color w:val="1F2328"/>
-          <w:spacing w:val="0"/>
-          <w:sz w:val="24"/>
-          <w:szCs w:val="24"/>
-          <w:shd w:val="clear" w:fill="FFFFFF"/>
-          <w:lang w:val="en-US" w:eastAsia="zh-CN"/>
-        </w:rPr>
-        <w:t>知会一号：</w:t>
-      </w:r>
-      <w:r>
-        <w:rPr>
-          <w:rFonts w:hint="eastAsia" w:ascii="宋体" w:hAnsi="宋体" w:eastAsia="宋体" w:cs="宋体"/>
-          <w:i w:val="0"/>
-          <w:iCs w:val="0"/>
-          <w:caps w:val="0"/>
-          <w:color w:val="1F2328"/>
-          <w:spacing w:val="0"/>
-          <w:sz w:val="24"/>
-          <w:szCs w:val="24"/>
-          <w:shd w:val="clear" w:fill="FFFFFF"/>
-        </w:rPr>
-        <w:t>面向政企单位的国产智能会议助手，集</w:t>
-      </w:r>
-      <w:r>
-        <w:rPr>
-          <w:rFonts w:hint="eastAsia" w:ascii="宋体" w:hAnsi="宋体" w:eastAsia="宋体" w:cs="宋体"/>
-          <w:i w:val="0"/>
-          <w:iCs w:val="0"/>
-          <w:caps w:val="0"/>
-          <w:color w:val="0000FF"/>
-          <w:spacing w:val="0"/>
-          <w:sz w:val="24"/>
-          <w:szCs w:val="24"/>
-          <w:shd w:val="clear" w:fill="FFFFFF"/>
-        </w:rPr>
-        <w:t>软硬件</w:t>
-      </w:r>
-      <w:r>
-        <w:rPr>
-          <w:rFonts w:hint="eastAsia" w:ascii="宋体" w:hAnsi="宋体" w:eastAsia="宋体" w:cs="宋体"/>
-          <w:i w:val="0"/>
-          <w:iCs w:val="0"/>
-          <w:caps w:val="0"/>
-          <w:color w:val="1F2328"/>
-          <w:spacing w:val="0"/>
-          <w:sz w:val="24"/>
-          <w:szCs w:val="24"/>
-          <w:shd w:val="clear" w:fill="FFFFFF"/>
-        </w:rPr>
-        <w:t>于一体，开机即用，致力于让会议管理更安全、更高效</w:t>
-      </w:r>
-      <w:r>
-        <w:rPr>
-          <w:rFonts w:hint="eastAsia" w:ascii="宋体" w:hAnsi="宋体" w:eastAsia="宋体" w:cs="宋体"/>
-          <w:i w:val="0"/>
-          <w:iCs w:val="0"/>
-          <w:caps w:val="0"/>
-          <w:color w:val="1F2328"/>
-          <w:spacing w:val="0"/>
-          <w:sz w:val="24"/>
-          <w:szCs w:val="24"/>
-          <w:shd w:val="clear" w:fill="FFFFFF"/>
-          <w:lang w:eastAsia="zh-CN"/>
-        </w:rPr>
-        <w:t>。</w:t>
-      </w:r>
-      <w:bookmarkStart w:id="0" w:name="_GoBack"/>
-      <w:bookmarkEnd w:id="0"/>
+        <w:t>SmartST：面向配置项测试自动化与验证闭环，支持测试用例生成（含测试数据）、执行回填及覆盖率统计。</w:t>
+      </w:r>
     </w:p>
     <w:p>
       <w:pPr>
@@ -4247,47 +2376,7 @@
         </w:rPr>
       </w:pPr>
       <w:r>
-        <w:rPr>
-          <w:rFonts w:hint="eastAsia" w:ascii="宋体" w:hAnsi="宋体" w:eastAsia="宋体" w:cs="宋体"/>
-          <w:i w:val="0"/>
-          <w:iCs w:val="0"/>
-          <w:caps w:val="0"/>
-          <w:color w:val="1F2328"/>
-          <w:spacing w:val="0"/>
-          <w:sz w:val="24"/>
-          <w:szCs w:val="24"/>
-          <w:shd w:val="clear" w:fill="FFFFFF"/>
-        </w:rPr>
-        <w:t>年度报价</w:t>
-      </w:r>
-      <w:r>
-        <w:rPr>
-          <w:rFonts w:hint="eastAsia" w:ascii="宋体" w:hAnsi="宋体" w:eastAsia="宋体" w:cs="宋体"/>
-          <w:i w:val="0"/>
-          <w:iCs w:val="0"/>
-          <w:caps w:val="0"/>
-          <w:color w:val="1F2328"/>
-          <w:spacing w:val="0"/>
-          <w:sz w:val="24"/>
-          <w:szCs w:val="24"/>
-          <w:shd w:val="clear" w:fill="FFFFFF"/>
-          <w:lang w:eastAsia="zh-CN"/>
-        </w:rPr>
-        <w:t>：</w:t>
-      </w:r>
-      <w:r>
-        <w:rPr>
-          <w:rFonts w:hint="eastAsia" w:ascii="宋体" w:hAnsi="宋体" w:eastAsia="宋体" w:cs="宋体"/>
-          <w:i w:val="0"/>
-          <w:iCs w:val="0"/>
-          <w:caps w:val="0"/>
-          <w:color w:val="1F2328"/>
-          <w:spacing w:val="0"/>
-          <w:sz w:val="24"/>
-          <w:szCs w:val="24"/>
-          <w:shd w:val="clear" w:fill="FFFFFF"/>
-        </w:rPr>
-        <w:t>为单用户年度授权价格，授权期满后可续费使用。</w:t>
+        <w:t>年度报价：为标准授权年度价格，包含标准版本升级及远程技术支持服务。</w:t>
       </w:r>
     </w:p>
     <w:p>
@@ -4325,119 +2414,7 @@
         </w:rPr>
       </w:pPr>
       <w:r>
-        <w:rPr>
-          <w:rFonts w:hint="eastAsia" w:ascii="宋体" w:hAnsi="宋体" w:eastAsia="宋体" w:cs="宋体"/>
-          <w:i w:val="0"/>
-          <w:iCs w:val="0"/>
-          <w:caps w:val="0"/>
-          <w:color w:val="1F2328"/>
-          <w:spacing w:val="0"/>
-          <w:sz w:val="24"/>
-          <w:szCs w:val="24"/>
-          <w:shd w:val="clear" w:fill="FFFFFF"/>
-        </w:rPr>
-        <w:t>一次性销售报价</w:t>
-      </w:r>
-      <w:r>
-        <w:rPr>
-          <w:rFonts w:hint="eastAsia" w:ascii="宋体" w:hAnsi="宋体" w:eastAsia="宋体" w:cs="宋体"/>
-          <w:i w:val="0"/>
-          <w:iCs w:val="0"/>
-          <w:caps w:val="0"/>
-          <w:color w:val="1F2328"/>
-          <w:spacing w:val="0"/>
-          <w:sz w:val="24"/>
-          <w:szCs w:val="24"/>
-          <w:shd w:val="clear" w:fill="FFFFFF"/>
-          <w:lang w:eastAsia="zh-CN"/>
-        </w:rPr>
-        <w:t>：</w:t>
-      </w:r>
-      <w:r>
-        <w:rPr>
-          <w:rFonts w:hint="eastAsia" w:ascii="宋体" w:hAnsi="宋体" w:eastAsia="宋体" w:cs="宋体"/>
-          <w:i w:val="0"/>
-          <w:iCs w:val="0"/>
-          <w:caps w:val="0"/>
-          <w:color w:val="1F2328"/>
-          <w:spacing w:val="0"/>
-          <w:sz w:val="24"/>
-          <w:szCs w:val="24"/>
-          <w:shd w:val="clear" w:fill="FFFFFF"/>
-        </w:rPr>
-        <w:t>为单用户永久授权价格，</w:t>
-      </w:r>
-      <w:r>
-        <w:rPr>
-          <w:rFonts w:hint="eastAsia" w:ascii="宋体" w:hAnsi="宋体" w:eastAsia="宋体" w:cs="宋体"/>
-          <w:i w:val="0"/>
-          <w:iCs w:val="0"/>
-          <w:caps w:val="0"/>
-          <w:color w:val="0000FF"/>
-          <w:spacing w:val="0"/>
-          <w:sz w:val="24"/>
-          <w:szCs w:val="24"/>
-          <w:shd w:val="clear" w:fill="FFFFFF"/>
-          <w:lang w:val="en-US" w:eastAsia="zh-CN"/>
-        </w:rPr>
-        <w:t>包含</w:t>
-      </w:r>
-      <w:r>
-        <w:rPr>
-          <w:rFonts w:hint="eastAsia" w:ascii="宋体" w:hAnsi="宋体" w:eastAsia="宋体" w:cs="宋体"/>
-          <w:i w:val="0"/>
-          <w:iCs w:val="0"/>
-          <w:caps w:val="0"/>
-          <w:color w:val="0000FF"/>
-          <w:spacing w:val="0"/>
-          <w:sz w:val="24"/>
-          <w:szCs w:val="24"/>
-          <w:shd w:val="clear" w:fill="FFFFFF"/>
-        </w:rPr>
-        <w:t>后续大版本升级</w:t>
-      </w:r>
-      <w:r>
-        <w:rPr>
-          <w:rFonts w:hint="eastAsia" w:ascii="宋体" w:hAnsi="宋体" w:eastAsia="宋体" w:cs="宋体"/>
-          <w:i w:val="0"/>
-          <w:iCs w:val="0"/>
-          <w:caps w:val="0"/>
-          <w:color w:val="0000FF"/>
-          <w:spacing w:val="0"/>
-          <w:sz w:val="24"/>
-          <w:szCs w:val="24"/>
-          <w:shd w:val="clear" w:fill="FFFFFF"/>
-          <w:lang w:val="en-US" w:eastAsia="zh-CN"/>
-        </w:rPr>
-        <w:t>及后续</w:t>
-      </w:r>
-      <w:r>
-        <w:rPr>
-          <w:rFonts w:hint="eastAsia" w:ascii="宋体" w:hAnsi="宋体" w:eastAsia="宋体" w:cs="宋体"/>
-          <w:i w:val="0"/>
-          <w:iCs w:val="0"/>
-          <w:caps w:val="0"/>
-          <w:color w:val="0000FF"/>
-          <w:spacing w:val="0"/>
-          <w:sz w:val="24"/>
-          <w:szCs w:val="24"/>
-          <w:shd w:val="clear" w:fill="FFFFFF"/>
-        </w:rPr>
-        <w:t>运维服务</w:t>
-      </w:r>
-      <w:r>
-        <w:rPr>
-          <w:rFonts w:hint="eastAsia" w:ascii="宋体" w:hAnsi="宋体" w:eastAsia="宋体" w:cs="宋体"/>
-          <w:i w:val="0"/>
-          <w:iCs w:val="0"/>
-          <w:caps w:val="0"/>
-          <w:color w:val="1F2328"/>
-          <w:spacing w:val="0"/>
-          <w:sz w:val="24"/>
-          <w:szCs w:val="24"/>
-          <w:shd w:val="clear" w:fill="FFFFFF"/>
-        </w:rPr>
-        <w:t>。</w:t>
+        <w:t>一次性销售报价：为标准授权永久授权价格，包含交付实施、后续大版本升级及基础运维服务。</w:t>
       </w:r>
     </w:p>
     <w:p>
@@ -4475,90 +2452,7 @@
         </w:rPr>
       </w:pPr>
       <w:r>
-        <w:rPr>
-          <w:rFonts w:hint="eastAsia" w:ascii="宋体" w:hAnsi="宋体" w:eastAsia="宋体" w:cs="宋体"/>
-          <w:i w:val="0"/>
-          <w:iCs w:val="0"/>
-          <w:caps w:val="0"/>
-          <w:color w:val="0000FF"/>
-          <w:spacing w:val="0"/>
-          <w:sz w:val="24"/>
-          <w:szCs w:val="24"/>
-          <w:shd w:val="clear" w:fill="FFFFFF"/>
-        </w:rPr>
-        <w:t>私有化</w:t>
-      </w:r>
-      <w:r>
-        <w:rPr>
-          <w:rFonts w:hint="eastAsia" w:ascii="宋体" w:hAnsi="宋体" w:eastAsia="宋体" w:cs="宋体"/>
-          <w:i w:val="0"/>
-          <w:iCs w:val="0"/>
-          <w:caps w:val="0"/>
-          <w:color w:val="0000FF"/>
-          <w:spacing w:val="0"/>
-          <w:sz w:val="24"/>
-          <w:szCs w:val="24"/>
-          <w:shd w:val="clear" w:fill="FFFFFF"/>
-          <w:lang w:val="en-US" w:eastAsia="zh-CN"/>
-        </w:rPr>
-        <w:t>大模型</w:t>
-      </w:r>
-      <w:r>
-        <w:rPr>
-          <w:rFonts w:hint="eastAsia" w:ascii="宋体" w:hAnsi="宋体" w:eastAsia="宋体" w:cs="宋体"/>
-          <w:i w:val="0"/>
-          <w:iCs w:val="0"/>
-          <w:caps w:val="0"/>
-          <w:color w:val="0000FF"/>
-          <w:spacing w:val="0"/>
-          <w:sz w:val="24"/>
-          <w:szCs w:val="24"/>
-          <w:shd w:val="clear" w:fill="FFFFFF"/>
-        </w:rPr>
-        <w:t>部署、国产化环境</w:t>
-      </w:r>
-      <w:r>
-        <w:rPr>
-          <w:rFonts w:hint="eastAsia" w:ascii="宋体" w:hAnsi="宋体" w:eastAsia="宋体" w:cs="宋体"/>
-          <w:i w:val="0"/>
-          <w:iCs w:val="0"/>
-          <w:caps w:val="0"/>
-          <w:color w:val="0000FF"/>
-          <w:spacing w:val="0"/>
-          <w:sz w:val="24"/>
-          <w:szCs w:val="24"/>
-          <w:shd w:val="clear" w:fill="FFFFFF"/>
-          <w:lang w:val="en-US" w:eastAsia="zh-CN"/>
-        </w:rPr>
-        <w:t>采购及</w:t>
-      </w:r>
-      <w:r>
-        <w:rPr>
-          <w:rFonts w:hint="eastAsia" w:ascii="宋体" w:hAnsi="宋体" w:eastAsia="宋体" w:cs="宋体"/>
-          <w:i w:val="0"/>
-          <w:iCs w:val="0"/>
-          <w:caps w:val="0"/>
-          <w:color w:val="0000FF"/>
-          <w:spacing w:val="0"/>
-          <w:sz w:val="24"/>
-          <w:szCs w:val="24"/>
-          <w:shd w:val="clear" w:fill="FFFFFF"/>
-        </w:rPr>
-        <w:t>适配</w:t>
-      </w:r>
-      <w:r>
-        <w:rPr>
-          <w:rFonts w:hint="eastAsia" w:ascii="宋体" w:hAnsi="宋体" w:eastAsia="宋体" w:cs="宋体"/>
-          <w:i w:val="0"/>
-          <w:iCs w:val="0"/>
-          <w:caps w:val="0"/>
-          <w:color w:val="1F2328"/>
-          <w:spacing w:val="0"/>
-          <w:sz w:val="24"/>
-          <w:szCs w:val="24"/>
-          <w:shd w:val="clear" w:fill="FFFFFF"/>
-        </w:rPr>
-        <w:t>、专属模型接入、知识库建设、培训服务、驻场实施及年度维护服务，可根据项目需求另行报价。</w:t>
+        <w:t>上述报价参考军工/嵌入式软件领域同类系统安全分析、软件安全分析、代码走查、单元测试及配置项测试工具的市场价格区间，并结合我方产品成熟度、知识库能力及交付服务成本综合测算。</w:t>
       </w:r>
     </w:p>
     <w:p>
@@ -4596,18 +2490,7 @@
         </w:rPr>
       </w:pPr>
       <w:r>
-        <w:rPr>
-          <w:rFonts w:hint="eastAsia" w:ascii="宋体" w:hAnsi="宋体" w:eastAsia="宋体" w:cs="宋体"/>
-          <w:i w:val="0"/>
-          <w:iCs w:val="0"/>
-          <w:caps w:val="0"/>
-          <w:color w:val="1F2328"/>
-          <w:spacing w:val="0"/>
-          <w:sz w:val="24"/>
-          <w:szCs w:val="24"/>
-          <w:shd w:val="clear" w:fill="FFFFFF"/>
-        </w:rPr>
-        <w:t>若采购数量达到多席位或形成专项合作，可在本报价基础上另行协商商务优惠。</w:t>
+        <w:t>私有化大模型部署、国产化环境采购及适配、专属模型接入、知识库建设、培训服务、驻场实施及年度维护服务，可根据项目需求另行报价。</w:t>
       </w:r>
     </w:p>
     <w:p>
@@ -5020,220 +2903,11 @@
         </w:rPr>
       </w:pPr>
       <w:r>
-        <w:rPr>
-          <w:rFonts w:hint="eastAsia" w:ascii="宋体" w:hAnsi="宋体" w:eastAsia="宋体" w:cs="宋体"/>
-          <w:i w:val="0"/>
-          <w:iCs w:val="0"/>
-          <w:caps w:val="0"/>
-          <w:color w:val="1F2328"/>
-          <w:spacing w:val="0"/>
-          <w:sz w:val="24"/>
-          <w:szCs w:val="24"/>
-          <w:shd w:val="clear" w:fill="FFFFFF"/>
-        </w:rPr>
-        <w:t>联系人： [</w:t>
-      </w:r>
-      <w:r>
-        <w:rPr>
-          <w:rFonts w:hint="eastAsia" w:ascii="宋体" w:hAnsi="宋体" w:eastAsia="宋体" w:cs="宋体"/>
-          <w:i w:val="0"/>
-          <w:iCs w:val="0"/>
-          <w:caps w:val="0"/>
-          <w:color w:val="1F2328"/>
-          <w:spacing w:val="0"/>
-          <w:sz w:val="24"/>
-          <w:szCs w:val="24"/>
-          <w:shd w:val="clear" w:fill="FFFFFF"/>
-          <w:lang w:val="en-US" w:eastAsia="zh-CN"/>
-        </w:rPr>
-        <w:t>XXXX</w:t>
-      </w:r>
-      <w:r>
-        <w:rPr>
-          <w:rFonts w:hint="eastAsia" w:ascii="宋体" w:hAnsi="宋体" w:eastAsia="宋体" w:cs="宋体"/>
-          <w:i w:val="0"/>
-          <w:iCs w:val="0"/>
-          <w:caps w:val="0"/>
-          <w:color w:val="1F2328"/>
-          <w:spacing w:val="0"/>
-          <w:sz w:val="24"/>
-          <w:szCs w:val="24"/>
-          <w:shd w:val="clear" w:fill="FFFFFF"/>
-        </w:rPr>
-        <w:t>]</w:t>
-      </w:r>
-      <w:r>
-        <w:rPr>
-          <w:rFonts w:hint="eastAsia" w:ascii="宋体" w:hAnsi="宋体" w:eastAsia="宋体" w:cs="宋体"/>
-          <w:i w:val="0"/>
-          <w:iCs w:val="0"/>
-          <w:caps w:val="0"/>
-          <w:color w:val="1F2328"/>
-          <w:spacing w:val="0"/>
-          <w:sz w:val="24"/>
-          <w:szCs w:val="24"/>
-          <w:shd w:val="clear" w:fill="FFFFFF"/>
-          <w:lang w:val="en-US" w:eastAsia="zh-CN"/>
-        </w:rPr>
-        <w:t xml:space="preserve">        </w:t>
-      </w:r>
-      <w:r>
-        <w:rPr>
-          <w:rFonts w:hint="eastAsia" w:ascii="宋体" w:hAnsi="宋体" w:eastAsia="宋体" w:cs="宋体"/>
-          <w:i w:val="0"/>
-          <w:iCs w:val="0"/>
-          <w:caps w:val="0"/>
-          <w:color w:val="1F2328"/>
-          <w:spacing w:val="0"/>
-          <w:sz w:val="24"/>
-          <w:szCs w:val="24"/>
-          <w:shd w:val="clear" w:fill="FFFFFF"/>
-        </w:rPr>
-        <w:t>联系电话： [</w:t>
-      </w:r>
-      <w:r>
-        <w:rPr>
-          <w:rFonts w:hint="eastAsia" w:ascii="宋体" w:hAnsi="宋体" w:eastAsia="宋体" w:cs="宋体"/>
-          <w:i w:val="0"/>
-          <w:iCs w:val="0"/>
-          <w:caps w:val="0"/>
-          <w:color w:val="1F2328"/>
-          <w:spacing w:val="0"/>
-          <w:sz w:val="24"/>
-          <w:szCs w:val="24"/>
-          <w:shd w:val="clear" w:fill="FFFFFF"/>
-          <w:lang w:val="en-US" w:eastAsia="zh-CN"/>
-        </w:rPr>
-        <w:t>XXXX</w:t>
-      </w:r>
-      <w:r>
-        <w:rPr>
-          <w:rFonts w:hint="eastAsia" w:ascii="宋体" w:hAnsi="宋体" w:eastAsia="宋体" w:cs="宋体"/>
-          <w:i w:val="0"/>
-          <w:iCs w:val="0"/>
-          <w:caps w:val="0"/>
-          <w:color w:val="1F2328"/>
-          <w:spacing w:val="0"/>
-          <w:sz w:val="24"/>
-          <w:szCs w:val="24"/>
-          <w:shd w:val="clear" w:fill="FFFFFF"/>
-        </w:rPr>
-        <w:t>]</w:t>
-      </w:r>
-      <w:r>
-        <w:rPr>
-          <w:rFonts w:hint="eastAsia" w:ascii="宋体" w:hAnsi="宋体" w:eastAsia="宋体" w:cs="宋体"/>
-          <w:i w:val="0"/>
-          <w:iCs w:val="0"/>
-          <w:caps w:val="0"/>
-          <w:color w:val="1F2328"/>
-          <w:spacing w:val="0"/>
-          <w:sz w:val="24"/>
-          <w:szCs w:val="24"/>
-          <w:shd w:val="clear" w:fill="FFFFFF"/>
-        </w:rPr>
-        <w:br w:type="textWrapping"/>
-      </w:r>
-      <w:r>
-        <w:rPr>
-          <w:rFonts w:hint="eastAsia" w:ascii="宋体" w:hAnsi="宋体" w:eastAsia="宋体" w:cs="宋体"/>
-          <w:i w:val="0"/>
-          <w:iCs w:val="0"/>
-          <w:caps w:val="0"/>
-          <w:color w:val="1F2328"/>
-          <w:spacing w:val="0"/>
-          <w:sz w:val="24"/>
-          <w:szCs w:val="24"/>
-          <w:shd w:val="clear" w:fill="FFFFFF"/>
-        </w:rPr>
-        <w:t>报价单位：</w:t>
-      </w:r>
-      <w:r>
-        <w:rPr>
-          <w:rFonts w:hint="eastAsia" w:ascii="宋体" w:hAnsi="宋体" w:eastAsia="宋体" w:cs="宋体"/>
-          <w:i w:val="0"/>
-          <w:iCs w:val="0"/>
-          <w:caps w:val="0"/>
-          <w:color w:val="1F2328"/>
-          <w:spacing w:val="0"/>
-          <w:sz w:val="24"/>
-          <w:szCs w:val="24"/>
-          <w:shd w:val="clear" w:fill="FFFFFF"/>
-          <w:lang w:val="en-US" w:eastAsia="zh-CN"/>
-        </w:rPr>
-        <w:t>北京神舟航天软件技术股份有限公司</w:t>
-      </w:r>
-      <w:r>
-        <w:rPr>
-          <w:rFonts w:hint="eastAsia" w:ascii="宋体" w:hAnsi="宋体" w:eastAsia="宋体" w:cs="宋体"/>
-          <w:i w:val="0"/>
-          <w:iCs w:val="0"/>
-          <w:caps w:val="0"/>
-          <w:color w:val="1F2328"/>
-          <w:spacing w:val="0"/>
-          <w:sz w:val="24"/>
-          <w:szCs w:val="24"/>
-          <w:shd w:val="clear" w:fill="FFFFFF"/>
-        </w:rPr>
-        <w:br w:type="textWrapping"/>
-      </w:r>
-      <w:r>
-        <w:rPr>
-          <w:rFonts w:hint="eastAsia" w:ascii="宋体" w:hAnsi="宋体" w:eastAsia="宋体" w:cs="宋体"/>
-          <w:i w:val="0"/>
-          <w:iCs w:val="0"/>
-          <w:caps w:val="0"/>
-          <w:color w:val="1F2328"/>
-          <w:spacing w:val="0"/>
-          <w:sz w:val="24"/>
-          <w:szCs w:val="24"/>
-          <w:shd w:val="clear" w:fill="FFFFFF"/>
-          <w:lang w:val="en-US" w:eastAsia="zh-CN"/>
-        </w:rPr>
-        <w:t>报价</w:t>
-      </w:r>
-      <w:r>
-        <w:rPr>
-          <w:rFonts w:hint="eastAsia" w:ascii="宋体" w:hAnsi="宋体" w:eastAsia="宋体" w:cs="宋体"/>
-          <w:i w:val="0"/>
-          <w:iCs w:val="0"/>
-          <w:caps w:val="0"/>
-          <w:color w:val="1F2328"/>
-          <w:spacing w:val="0"/>
-          <w:sz w:val="24"/>
-          <w:szCs w:val="24"/>
-          <w:shd w:val="clear" w:fill="FFFFFF"/>
-        </w:rPr>
-        <w:t>日期： </w:t>
-      </w:r>
-      <w:r>
-        <w:rPr>
-          <w:rFonts w:hint="eastAsia" w:ascii="宋体" w:hAnsi="宋体" w:eastAsia="宋体" w:cs="宋体"/>
-          <w:i w:val="0"/>
-          <w:iCs w:val="0"/>
-          <w:caps w:val="0"/>
-          <w:color w:val="1F2328"/>
-          <w:spacing w:val="0"/>
-          <w:sz w:val="24"/>
-          <w:szCs w:val="24"/>
-          <w:shd w:val="clear" w:fill="FFFFFF"/>
-          <w:lang w:val="en-US" w:eastAsia="zh-CN"/>
-        </w:rPr>
-        <w:t xml:space="preserve">              </w:t>
-      </w:r>
-      <w:r>
-        <w:rPr>
-          <w:rFonts w:hint="eastAsia" w:ascii="宋体" w:hAnsi="宋体" w:eastAsia="宋体" w:cs="宋体"/>
-          <w:i w:val="0"/>
-          <w:iCs w:val="0"/>
-          <w:caps w:val="0"/>
-          <w:color w:val="1F2328"/>
-          <w:spacing w:val="0"/>
-          <w:sz w:val="24"/>
-          <w:szCs w:val="24"/>
-          <w:shd w:val="clear" w:fill="FFFFFF"/>
-        </w:rPr>
-        <w:t>2026年05月15日</w:t>
+        <w:t>联系人：[XXXX]        联系电话：[XXXX]</w:t>
+        <w:br/>
+        <w:t>报价单位：北京神舟航天软件技术股份有限公司</w:t>
+        <w:br/>
+        <w:t>报价日期：2026年05月16日</w:t>
       </w:r>
     </w:p>
     <w:p>

</xml_diff>